<commit_message>
fix greenlet for Render Linux build
</commit_message>
<xml_diff>
--- a/deploy.docx
+++ b/deploy.docx
@@ -7179,6 +7179,1634 @@
       </w:r>
     </w:p>
     <w:p>
+      <w:pPr>
+        <w:pBdr>
+          <w:bottom w:val="single" w:sz="6" w:space="1" w:color="auto"/>
+        </w:pBdr>
+      </w:pPr>
+    </w:p>
+    <w:p>
+      <w:pPr>
+        <w:rPr>
+          <w:lang w:val="en-US"/>
+        </w:rPr>
+      </w:pPr>
+    </w:p>
+    <w:p>
+      <w:pPr>
+        <w:pStyle w:val="Heading2"/>
+        <w:pBdr>
+          <w:top w:val="single" w:sz="2" w:space="0" w:color="auto"/>
+          <w:left w:val="single" w:sz="2" w:space="0" w:color="auto"/>
+          <w:bottom w:val="single" w:sz="2" w:space="0" w:color="auto"/>
+          <w:right w:val="single" w:sz="2" w:space="0" w:color="auto"/>
+        </w:pBdr>
+        <w:shd w:val="clear" w:color="auto" w:fill="FCFCFC"/>
+        <w:spacing w:before="0" w:beforeAutospacing="0" w:after="360" w:afterAutospacing="0" w:line="315" w:lineRule="atLeast"/>
+        <w:rPr>
+          <w:rFonts w:ascii="Segoe UI" w:hAnsi="Segoe UI" w:cs="Segoe UI"/>
+          <w:b w:val="0"/>
+          <w:bCs w:val="0"/>
+          <w:color w:val="171717"/>
+          <w:sz w:val="21"/>
+          <w:szCs w:val="21"/>
+        </w:rPr>
+      </w:pPr>
+      <w:r>
+        <w:rPr>
+          <w:rFonts w:ascii="Segoe UI" w:hAnsi="Segoe UI" w:cs="Segoe UI"/>
+          <w:b w:val="0"/>
+          <w:bCs w:val="0"/>
+          <w:color w:val="171717"/>
+          <w:sz w:val="21"/>
+          <w:szCs w:val="21"/>
+        </w:rPr>
+        <w:t>Step 1: Install GitHub Desktop</w:t>
+      </w:r>
+    </w:p>
+    <w:p>
+      <w:pPr>
+        <w:numPr>
+          <w:ilvl w:val="0"/>
+          <w:numId w:val="11"/>
+        </w:numPr>
+        <w:pBdr>
+          <w:top w:val="single" w:sz="2" w:space="0" w:color="auto"/>
+          <w:left w:val="single" w:sz="2" w:space="0" w:color="auto"/>
+          <w:bottom w:val="single" w:sz="2" w:space="0" w:color="auto"/>
+          <w:right w:val="single" w:sz="2" w:space="0" w:color="auto"/>
+        </w:pBdr>
+        <w:shd w:val="clear" w:color="auto" w:fill="FCFCFC"/>
+        <w:spacing w:after="0" w:line="240" w:lineRule="auto"/>
+        <w:ind w:left="0"/>
+        <w:rPr>
+          <w:rFonts w:ascii="Segoe UI" w:hAnsi="Segoe UI" w:cs="Segoe UI"/>
+          <w:color w:val="171717"/>
+          <w:sz w:val="21"/>
+          <w:szCs w:val="21"/>
+        </w:rPr>
+      </w:pPr>
+      <w:r>
+        <w:rPr>
+          <w:rFonts w:ascii="Segoe UI" w:hAnsi="Segoe UI" w:cs="Segoe UI"/>
+          <w:color w:val="171717"/>
+          <w:sz w:val="21"/>
+          <w:szCs w:val="21"/>
+        </w:rPr>
+        <w:t>Go to </w:t>
+      </w:r>
+      <w:hyperlink r:id="rId8" w:tgtFrame="_blank" w:history="1">
+        <w:r>
+          <w:rPr>
+            <w:rStyle w:val="Hyperlink"/>
+            <w:rFonts w:ascii="Segoe UI" w:hAnsi="Segoe UI" w:cs="Segoe UI"/>
+            <w:color w:val="0445E6"/>
+            <w:sz w:val="21"/>
+            <w:szCs w:val="21"/>
+            <w:u w:val="none"/>
+            <w:bdr w:val="single" w:sz="2" w:space="0" w:color="auto" w:frame="1"/>
+          </w:rPr>
+          <w:t>https://desktop.github.com</w:t>
+        </w:r>
+      </w:hyperlink>
+    </w:p>
+    <w:p>
+      <w:pPr>
+        <w:numPr>
+          <w:ilvl w:val="0"/>
+          <w:numId w:val="11"/>
+        </w:numPr>
+        <w:pBdr>
+          <w:top w:val="single" w:sz="2" w:space="0" w:color="auto"/>
+          <w:left w:val="single" w:sz="2" w:space="0" w:color="auto"/>
+          <w:bottom w:val="single" w:sz="2" w:space="0" w:color="auto"/>
+          <w:right w:val="single" w:sz="2" w:space="0" w:color="auto"/>
+        </w:pBdr>
+        <w:shd w:val="clear" w:color="auto" w:fill="FCFCFC"/>
+        <w:spacing w:after="0" w:line="240" w:lineRule="auto"/>
+        <w:ind w:left="0"/>
+        <w:rPr>
+          <w:rFonts w:ascii="Segoe UI" w:hAnsi="Segoe UI" w:cs="Segoe UI"/>
+          <w:color w:val="171717"/>
+          <w:sz w:val="21"/>
+          <w:szCs w:val="21"/>
+        </w:rPr>
+      </w:pPr>
+      <w:r>
+        <w:rPr>
+          <w:rFonts w:ascii="Segoe UI" w:hAnsi="Segoe UI" w:cs="Segoe UI"/>
+          <w:color w:val="171717"/>
+          <w:sz w:val="21"/>
+          <w:szCs w:val="21"/>
+        </w:rPr>
+        <w:t>Click the big </w:t>
+      </w:r>
+      <w:r>
+        <w:rPr>
+          <w:rStyle w:val="Strong"/>
+          <w:rFonts w:ascii="Segoe UI" w:hAnsi="Segoe UI" w:cs="Segoe UI"/>
+          <w:b w:val="0"/>
+          <w:bCs w:val="0"/>
+          <w:color w:val="171717"/>
+          <w:sz w:val="21"/>
+          <w:szCs w:val="21"/>
+          <w:bdr w:val="single" w:sz="2" w:space="0" w:color="auto" w:frame="1"/>
+        </w:rPr>
+        <w:t>"Download for Windows"</w:t>
+      </w:r>
+      <w:r>
+        <w:rPr>
+          <w:rFonts w:ascii="Segoe UI" w:hAnsi="Segoe UI" w:cs="Segoe UI"/>
+          <w:color w:val="171717"/>
+          <w:sz w:val="21"/>
+          <w:szCs w:val="21"/>
+        </w:rPr>
+        <w:t> button</w:t>
+      </w:r>
+    </w:p>
+    <w:p>
+      <w:pPr>
+        <w:numPr>
+          <w:ilvl w:val="0"/>
+          <w:numId w:val="11"/>
+        </w:numPr>
+        <w:pBdr>
+          <w:top w:val="single" w:sz="2" w:space="0" w:color="auto"/>
+          <w:left w:val="single" w:sz="2" w:space="0" w:color="auto"/>
+          <w:bottom w:val="single" w:sz="2" w:space="0" w:color="auto"/>
+          <w:right w:val="single" w:sz="2" w:space="0" w:color="auto"/>
+        </w:pBdr>
+        <w:shd w:val="clear" w:color="auto" w:fill="FCFCFC"/>
+        <w:spacing w:after="120" w:line="240" w:lineRule="auto"/>
+        <w:ind w:left="0"/>
+        <w:rPr>
+          <w:rFonts w:ascii="Segoe UI" w:hAnsi="Segoe UI" w:cs="Segoe UI"/>
+          <w:color w:val="171717"/>
+          <w:sz w:val="21"/>
+          <w:szCs w:val="21"/>
+        </w:rPr>
+      </w:pPr>
+      <w:r>
+        <w:rPr>
+          <w:rFonts w:ascii="Segoe UI" w:hAnsi="Segoe UI" w:cs="Segoe UI"/>
+          <w:color w:val="171717"/>
+          <w:sz w:val="21"/>
+          <w:szCs w:val="21"/>
+        </w:rPr>
+        <w:t>Open the downloaded file and install it (click Next, Next, Finish)</w:t>
+      </w:r>
+    </w:p>
+    <w:p>
+      <w:pPr>
+        <w:numPr>
+          <w:ilvl w:val="0"/>
+          <w:numId w:val="11"/>
+        </w:numPr>
+        <w:pBdr>
+          <w:top w:val="single" w:sz="2" w:space="0" w:color="auto"/>
+          <w:left w:val="single" w:sz="2" w:space="0" w:color="auto"/>
+          <w:bottom w:val="single" w:sz="2" w:space="0" w:color="auto"/>
+          <w:right w:val="single" w:sz="2" w:space="0" w:color="auto"/>
+        </w:pBdr>
+        <w:shd w:val="clear" w:color="auto" w:fill="FCFCFC"/>
+        <w:spacing w:after="120" w:line="240" w:lineRule="auto"/>
+        <w:ind w:left="0"/>
+        <w:rPr>
+          <w:rFonts w:ascii="Segoe UI" w:hAnsi="Segoe UI" w:cs="Segoe UI"/>
+          <w:color w:val="171717"/>
+          <w:sz w:val="21"/>
+          <w:szCs w:val="21"/>
+        </w:rPr>
+      </w:pPr>
+      <w:r>
+        <w:rPr>
+          <w:rFonts w:ascii="Segoe UI" w:hAnsi="Segoe UI" w:cs="Segoe UI"/>
+          <w:color w:val="171717"/>
+          <w:sz w:val="21"/>
+          <w:szCs w:val="21"/>
+        </w:rPr>
+        <w:t>Open GitHub Desktop</w:t>
+      </w:r>
+    </w:p>
+    <w:p>
+      <w:pPr>
+        <w:numPr>
+          <w:ilvl w:val="0"/>
+          <w:numId w:val="11"/>
+        </w:numPr>
+        <w:pBdr>
+          <w:top w:val="single" w:sz="2" w:space="0" w:color="auto"/>
+          <w:left w:val="single" w:sz="2" w:space="0" w:color="auto"/>
+          <w:bottom w:val="single" w:sz="2" w:space="0" w:color="auto"/>
+          <w:right w:val="single" w:sz="2" w:space="0" w:color="auto"/>
+        </w:pBdr>
+        <w:shd w:val="clear" w:color="auto" w:fill="FCFCFC"/>
+        <w:spacing w:after="0" w:line="240" w:lineRule="auto"/>
+        <w:ind w:left="0"/>
+        <w:rPr>
+          <w:rFonts w:ascii="Segoe UI" w:hAnsi="Segoe UI" w:cs="Segoe UI"/>
+          <w:color w:val="171717"/>
+          <w:sz w:val="21"/>
+          <w:szCs w:val="21"/>
+        </w:rPr>
+      </w:pPr>
+      <w:r>
+        <w:rPr>
+          <w:rFonts w:ascii="Segoe UI" w:hAnsi="Segoe UI" w:cs="Segoe UI"/>
+          <w:color w:val="171717"/>
+          <w:sz w:val="21"/>
+          <w:szCs w:val="21"/>
+        </w:rPr>
+        <w:t>Click </w:t>
+      </w:r>
+      <w:r>
+        <w:rPr>
+          <w:rStyle w:val="Strong"/>
+          <w:rFonts w:ascii="Segoe UI" w:hAnsi="Segoe UI" w:cs="Segoe UI"/>
+          <w:b w:val="0"/>
+          <w:bCs w:val="0"/>
+          <w:color w:val="171717"/>
+          <w:sz w:val="21"/>
+          <w:szCs w:val="21"/>
+          <w:bdr w:val="single" w:sz="2" w:space="0" w:color="auto" w:frame="1"/>
+        </w:rPr>
+        <w:t>"Sign in to GitHub.com"</w:t>
+      </w:r>
+      <w:r>
+        <w:rPr>
+          <w:rFonts w:ascii="Segoe UI" w:hAnsi="Segoe UI" w:cs="Segoe UI"/>
+          <w:color w:val="171717"/>
+          <w:sz w:val="21"/>
+          <w:szCs w:val="21"/>
+        </w:rPr>
+        <w:t> — it will open your browser</w:t>
+      </w:r>
+    </w:p>
+    <w:p>
+      <w:pPr>
+        <w:numPr>
+          <w:ilvl w:val="0"/>
+          <w:numId w:val="11"/>
+        </w:numPr>
+        <w:pBdr>
+          <w:top w:val="single" w:sz="2" w:space="0" w:color="auto"/>
+          <w:left w:val="single" w:sz="2" w:space="0" w:color="auto"/>
+          <w:bottom w:val="single" w:sz="2" w:space="0" w:color="auto"/>
+          <w:right w:val="single" w:sz="2" w:space="0" w:color="auto"/>
+        </w:pBdr>
+        <w:shd w:val="clear" w:color="auto" w:fill="FCFCFC"/>
+        <w:spacing w:after="120" w:line="240" w:lineRule="auto"/>
+        <w:ind w:left="0"/>
+        <w:rPr>
+          <w:rFonts w:ascii="Segoe UI" w:hAnsi="Segoe UI" w:cs="Segoe UI"/>
+          <w:color w:val="171717"/>
+          <w:sz w:val="21"/>
+          <w:szCs w:val="21"/>
+        </w:rPr>
+      </w:pPr>
+      <w:r>
+        <w:rPr>
+          <w:rFonts w:ascii="Segoe UI" w:hAnsi="Segoe UI" w:cs="Segoe UI"/>
+          <w:color w:val="171717"/>
+          <w:sz w:val="21"/>
+          <w:szCs w:val="21"/>
+        </w:rPr>
+        <w:t>Log in to your GitHub account in the browser</w:t>
+      </w:r>
+    </w:p>
+    <w:p>
+      <w:pPr>
+        <w:numPr>
+          <w:ilvl w:val="0"/>
+          <w:numId w:val="11"/>
+        </w:numPr>
+        <w:pBdr>
+          <w:top w:val="single" w:sz="2" w:space="0" w:color="auto"/>
+          <w:left w:val="single" w:sz="2" w:space="0" w:color="auto"/>
+          <w:bottom w:val="single" w:sz="2" w:space="0" w:color="auto"/>
+          <w:right w:val="single" w:sz="2" w:space="0" w:color="auto"/>
+        </w:pBdr>
+        <w:shd w:val="clear" w:color="auto" w:fill="FCFCFC"/>
+        <w:spacing w:after="0" w:line="240" w:lineRule="auto"/>
+        <w:ind w:left="0"/>
+        <w:rPr>
+          <w:rFonts w:ascii="Segoe UI" w:hAnsi="Segoe UI" w:cs="Segoe UI"/>
+          <w:color w:val="171717"/>
+          <w:sz w:val="21"/>
+          <w:szCs w:val="21"/>
+        </w:rPr>
+      </w:pPr>
+      <w:r>
+        <w:rPr>
+          <w:rFonts w:ascii="Segoe UI" w:hAnsi="Segoe UI" w:cs="Segoe UI"/>
+          <w:color w:val="171717"/>
+          <w:sz w:val="21"/>
+          <w:szCs w:val="21"/>
+        </w:rPr>
+        <w:t>Click </w:t>
+      </w:r>
+      <w:r>
+        <w:rPr>
+          <w:rStyle w:val="Strong"/>
+          <w:rFonts w:ascii="Segoe UI" w:hAnsi="Segoe UI" w:cs="Segoe UI"/>
+          <w:b w:val="0"/>
+          <w:bCs w:val="0"/>
+          <w:color w:val="171717"/>
+          <w:sz w:val="21"/>
+          <w:szCs w:val="21"/>
+          <w:bdr w:val="single" w:sz="2" w:space="0" w:color="auto" w:frame="1"/>
+        </w:rPr>
+        <w:t>"Authorize Desktop"</w:t>
+      </w:r>
+    </w:p>
+    <w:p>
+      <w:pPr>
+        <w:numPr>
+          <w:ilvl w:val="0"/>
+          <w:numId w:val="11"/>
+        </w:numPr>
+        <w:pBdr>
+          <w:top w:val="single" w:sz="2" w:space="0" w:color="auto"/>
+          <w:left w:val="single" w:sz="2" w:space="0" w:color="auto"/>
+          <w:bottom w:val="single" w:sz="2" w:space="0" w:color="auto"/>
+          <w:right w:val="single" w:sz="2" w:space="0" w:color="auto"/>
+        </w:pBdr>
+        <w:shd w:val="clear" w:color="auto" w:fill="FCFCFC"/>
+        <w:spacing w:after="120" w:line="240" w:lineRule="auto"/>
+        <w:ind w:left="0"/>
+        <w:rPr>
+          <w:rFonts w:ascii="Segoe UI" w:hAnsi="Segoe UI" w:cs="Segoe UI"/>
+          <w:color w:val="171717"/>
+          <w:sz w:val="21"/>
+          <w:szCs w:val="21"/>
+        </w:rPr>
+      </w:pPr>
+      <w:r>
+        <w:rPr>
+          <w:rFonts w:ascii="Segoe UI" w:hAnsi="Segoe UI" w:cs="Segoe UI"/>
+          <w:color w:val="171717"/>
+          <w:sz w:val="21"/>
+          <w:szCs w:val="21"/>
+        </w:rPr>
+        <w:t>It will ask for your name and email — fill them in</w:t>
+      </w:r>
+    </w:p>
+    <w:p>
+      <w:pPr>
+        <w:pStyle w:val="Heading2"/>
+        <w:pBdr>
+          <w:top w:val="single" w:sz="2" w:space="0" w:color="auto"/>
+          <w:left w:val="single" w:sz="2" w:space="0" w:color="auto"/>
+          <w:bottom w:val="single" w:sz="2" w:space="0" w:color="auto"/>
+          <w:right w:val="single" w:sz="2" w:space="0" w:color="auto"/>
+        </w:pBdr>
+        <w:shd w:val="clear" w:color="auto" w:fill="FCFCFC"/>
+        <w:spacing w:before="0" w:beforeAutospacing="0" w:after="360" w:afterAutospacing="0" w:line="315" w:lineRule="atLeast"/>
+        <w:rPr>
+          <w:rFonts w:ascii="Segoe UI" w:hAnsi="Segoe UI" w:cs="Segoe UI"/>
+          <w:b w:val="0"/>
+          <w:bCs w:val="0"/>
+          <w:color w:val="171717"/>
+          <w:sz w:val="21"/>
+          <w:szCs w:val="21"/>
+        </w:rPr>
+      </w:pPr>
+      <w:r>
+        <w:rPr>
+          <w:rFonts w:ascii="Segoe UI" w:hAnsi="Segoe UI" w:cs="Segoe UI"/>
+          <w:b w:val="0"/>
+          <w:bCs w:val="0"/>
+          <w:color w:val="171717"/>
+          <w:sz w:val="21"/>
+          <w:szCs w:val="21"/>
+        </w:rPr>
+        <w:t>Step 2: Create your repository on GitHub</w:t>
+      </w:r>
+    </w:p>
+    <w:p>
+      <w:pPr>
+        <w:numPr>
+          <w:ilvl w:val="0"/>
+          <w:numId w:val="12"/>
+        </w:numPr>
+        <w:pBdr>
+          <w:top w:val="single" w:sz="2" w:space="0" w:color="auto"/>
+          <w:left w:val="single" w:sz="2" w:space="0" w:color="auto"/>
+          <w:bottom w:val="single" w:sz="2" w:space="0" w:color="auto"/>
+          <w:right w:val="single" w:sz="2" w:space="0" w:color="auto"/>
+        </w:pBdr>
+        <w:shd w:val="clear" w:color="auto" w:fill="FCFCFC"/>
+        <w:spacing w:after="0" w:line="240" w:lineRule="auto"/>
+        <w:ind w:left="0"/>
+        <w:rPr>
+          <w:rFonts w:ascii="Segoe UI" w:hAnsi="Segoe UI" w:cs="Segoe UI"/>
+          <w:color w:val="171717"/>
+          <w:sz w:val="21"/>
+          <w:szCs w:val="21"/>
+        </w:rPr>
+      </w:pPr>
+      <w:r>
+        <w:rPr>
+          <w:rFonts w:ascii="Segoe UI" w:hAnsi="Segoe UI" w:cs="Segoe UI"/>
+          <w:color w:val="171717"/>
+          <w:sz w:val="21"/>
+          <w:szCs w:val="21"/>
+        </w:rPr>
+        <w:t>Go to </w:t>
+      </w:r>
+      <w:hyperlink r:id="rId9" w:tgtFrame="_blank" w:history="1">
+        <w:r>
+          <w:rPr>
+            <w:rStyle w:val="Hyperlink"/>
+            <w:rFonts w:ascii="Segoe UI" w:hAnsi="Segoe UI" w:cs="Segoe UI"/>
+            <w:color w:val="0445E6"/>
+            <w:sz w:val="21"/>
+            <w:szCs w:val="21"/>
+            <w:u w:val="none"/>
+            <w:bdr w:val="single" w:sz="2" w:space="0" w:color="auto" w:frame="1"/>
+          </w:rPr>
+          <w:t>https://github.com/new</w:t>
+        </w:r>
+      </w:hyperlink>
+      <w:r>
+        <w:rPr>
+          <w:rFonts w:ascii="Segoe UI" w:hAnsi="Segoe UI" w:cs="Segoe UI"/>
+          <w:color w:val="171717"/>
+          <w:sz w:val="21"/>
+          <w:szCs w:val="21"/>
+        </w:rPr>
+        <w:t> in your browser</w:t>
+      </w:r>
+    </w:p>
+    <w:p>
+      <w:pPr>
+        <w:numPr>
+          <w:ilvl w:val="0"/>
+          <w:numId w:val="12"/>
+        </w:numPr>
+        <w:pBdr>
+          <w:top w:val="single" w:sz="2" w:space="0" w:color="auto"/>
+          <w:left w:val="single" w:sz="2" w:space="0" w:color="auto"/>
+          <w:bottom w:val="single" w:sz="2" w:space="0" w:color="auto"/>
+          <w:right w:val="single" w:sz="2" w:space="0" w:color="auto"/>
+        </w:pBdr>
+        <w:shd w:val="clear" w:color="auto" w:fill="FCFCFC"/>
+        <w:spacing w:after="0" w:line="240" w:lineRule="auto"/>
+        <w:ind w:left="0"/>
+        <w:rPr>
+          <w:rFonts w:ascii="Segoe UI" w:hAnsi="Segoe UI" w:cs="Segoe UI"/>
+          <w:color w:val="171717"/>
+          <w:sz w:val="21"/>
+          <w:szCs w:val="21"/>
+        </w:rPr>
+      </w:pPr>
+      <w:r>
+        <w:rPr>
+          <w:rFonts w:ascii="Segoe UI" w:hAnsi="Segoe UI" w:cs="Segoe UI"/>
+          <w:color w:val="171717"/>
+          <w:sz w:val="21"/>
+          <w:szCs w:val="21"/>
+        </w:rPr>
+        <w:t>In "Repository name" type: </w:t>
+      </w:r>
+      <w:r>
+        <w:rPr>
+          <w:rStyle w:val="HTMLCode"/>
+          <w:rFonts w:ascii="Consolas" w:eastAsiaTheme="minorHAnsi" w:hAnsi="Consolas"/>
+          <w:color w:val="00CEB9"/>
+          <w:sz w:val="21"/>
+          <w:szCs w:val="21"/>
+          <w:bdr w:val="single" w:sz="2" w:space="0" w:color="auto" w:frame="1"/>
+        </w:rPr>
+        <w:t>taskmaster</w:t>
+      </w:r>
+    </w:p>
+    <w:p>
+      <w:pPr>
+        <w:numPr>
+          <w:ilvl w:val="0"/>
+          <w:numId w:val="12"/>
+        </w:numPr>
+        <w:pBdr>
+          <w:top w:val="single" w:sz="2" w:space="0" w:color="auto"/>
+          <w:left w:val="single" w:sz="2" w:space="0" w:color="auto"/>
+          <w:bottom w:val="single" w:sz="2" w:space="0" w:color="auto"/>
+          <w:right w:val="single" w:sz="2" w:space="0" w:color="auto"/>
+        </w:pBdr>
+        <w:shd w:val="clear" w:color="auto" w:fill="FCFCFC"/>
+        <w:spacing w:after="0" w:line="240" w:lineRule="auto"/>
+        <w:ind w:left="0"/>
+        <w:rPr>
+          <w:rFonts w:ascii="Segoe UI" w:hAnsi="Segoe UI" w:cs="Segoe UI"/>
+          <w:color w:val="171717"/>
+          <w:sz w:val="21"/>
+          <w:szCs w:val="21"/>
+        </w:rPr>
+      </w:pPr>
+      <w:r>
+        <w:rPr>
+          <w:rFonts w:ascii="Segoe UI" w:hAnsi="Segoe UI" w:cs="Segoe UI"/>
+          <w:color w:val="171717"/>
+          <w:sz w:val="21"/>
+          <w:szCs w:val="21"/>
+        </w:rPr>
+        <w:lastRenderedPageBreak/>
+        <w:t>Click the green </w:t>
+      </w:r>
+      <w:r>
+        <w:rPr>
+          <w:rStyle w:val="Strong"/>
+          <w:rFonts w:ascii="Segoe UI" w:hAnsi="Segoe UI" w:cs="Segoe UI"/>
+          <w:b w:val="0"/>
+          <w:bCs w:val="0"/>
+          <w:color w:val="171717"/>
+          <w:sz w:val="21"/>
+          <w:szCs w:val="21"/>
+          <w:bdr w:val="single" w:sz="2" w:space="0" w:color="auto" w:frame="1"/>
+        </w:rPr>
+        <w:t>"Create repository"</w:t>
+      </w:r>
+      <w:r>
+        <w:rPr>
+          <w:rFonts w:ascii="Segoe UI" w:hAnsi="Segoe UI" w:cs="Segoe UI"/>
+          <w:color w:val="171717"/>
+          <w:sz w:val="21"/>
+          <w:szCs w:val="21"/>
+        </w:rPr>
+        <w:t> button</w:t>
+      </w:r>
+    </w:p>
+    <w:p>
+      <w:pPr>
+        <w:numPr>
+          <w:ilvl w:val="0"/>
+          <w:numId w:val="12"/>
+        </w:numPr>
+        <w:pBdr>
+          <w:top w:val="single" w:sz="2" w:space="0" w:color="auto"/>
+          <w:left w:val="single" w:sz="2" w:space="0" w:color="auto"/>
+          <w:bottom w:val="single" w:sz="2" w:space="0" w:color="auto"/>
+          <w:right w:val="single" w:sz="2" w:space="0" w:color="auto"/>
+        </w:pBdr>
+        <w:shd w:val="clear" w:color="auto" w:fill="FCFCFC"/>
+        <w:spacing w:after="120" w:line="240" w:lineRule="auto"/>
+        <w:ind w:left="0"/>
+        <w:rPr>
+          <w:rFonts w:ascii="Segoe UI" w:hAnsi="Segoe UI" w:cs="Segoe UI"/>
+          <w:color w:val="171717"/>
+          <w:sz w:val="21"/>
+          <w:szCs w:val="21"/>
+        </w:rPr>
+      </w:pPr>
+      <w:r>
+        <w:rPr>
+          <w:rFonts w:ascii="Segoe UI" w:hAnsi="Segoe UI" w:cs="Segoe UI"/>
+          <w:color w:val="171717"/>
+          <w:sz w:val="21"/>
+          <w:szCs w:val="21"/>
+        </w:rPr>
+        <w:t>Keep this page open</w:t>
+      </w:r>
+    </w:p>
+    <w:p>
+      <w:pPr>
+        <w:pStyle w:val="Heading2"/>
+        <w:pBdr>
+          <w:top w:val="single" w:sz="2" w:space="0" w:color="auto"/>
+          <w:left w:val="single" w:sz="2" w:space="0" w:color="auto"/>
+          <w:bottom w:val="single" w:sz="2" w:space="0" w:color="auto"/>
+          <w:right w:val="single" w:sz="2" w:space="0" w:color="auto"/>
+        </w:pBdr>
+        <w:shd w:val="clear" w:color="auto" w:fill="FCFCFC"/>
+        <w:spacing w:before="0" w:beforeAutospacing="0" w:after="360" w:afterAutospacing="0" w:line="315" w:lineRule="atLeast"/>
+        <w:rPr>
+          <w:rFonts w:ascii="Segoe UI" w:hAnsi="Segoe UI" w:cs="Segoe UI"/>
+          <w:b w:val="0"/>
+          <w:bCs w:val="0"/>
+          <w:color w:val="171717"/>
+          <w:sz w:val="21"/>
+          <w:szCs w:val="21"/>
+        </w:rPr>
+      </w:pPr>
+      <w:r>
+        <w:rPr>
+          <w:rFonts w:ascii="Segoe UI" w:hAnsi="Segoe UI" w:cs="Segoe UI"/>
+          <w:b w:val="0"/>
+          <w:bCs w:val="0"/>
+          <w:color w:val="171717"/>
+          <w:sz w:val="21"/>
+          <w:szCs w:val="21"/>
+        </w:rPr>
+        <w:t>Step 3: Upload your project from GitHub Desktop</w:t>
+      </w:r>
+    </w:p>
+    <w:p>
+      <w:pPr>
+        <w:pStyle w:val="NormalWeb"/>
+        <w:numPr>
+          <w:ilvl w:val="0"/>
+          <w:numId w:val="13"/>
+        </w:numPr>
+        <w:pBdr>
+          <w:top w:val="single" w:sz="2" w:space="0" w:color="auto"/>
+          <w:left w:val="single" w:sz="2" w:space="0" w:color="auto"/>
+          <w:bottom w:val="single" w:sz="2" w:space="0" w:color="auto"/>
+          <w:right w:val="single" w:sz="2" w:space="0" w:color="auto"/>
+        </w:pBdr>
+        <w:shd w:val="clear" w:color="auto" w:fill="FCFCFC"/>
+        <w:spacing w:before="0" w:beforeAutospacing="0" w:after="0" w:afterAutospacing="0"/>
+        <w:ind w:left="0"/>
+        <w:rPr>
+          <w:rFonts w:ascii="Segoe UI" w:hAnsi="Segoe UI" w:cs="Segoe UI"/>
+          <w:color w:val="171717"/>
+          <w:sz w:val="21"/>
+          <w:szCs w:val="21"/>
+        </w:rPr>
+      </w:pPr>
+      <w:r>
+        <w:rPr>
+          <w:rFonts w:ascii="Segoe UI" w:hAnsi="Segoe UI" w:cs="Segoe UI"/>
+          <w:color w:val="171717"/>
+          <w:sz w:val="21"/>
+          <w:szCs w:val="21"/>
+        </w:rPr>
+        <w:t>In GitHub Desktop, click </w:t>
+      </w:r>
+      <w:r>
+        <w:rPr>
+          <w:rStyle w:val="Strong"/>
+          <w:rFonts w:ascii="Segoe UI" w:hAnsi="Segoe UI" w:cs="Segoe UI"/>
+          <w:b w:val="0"/>
+          <w:bCs w:val="0"/>
+          <w:color w:val="171717"/>
+          <w:sz w:val="21"/>
+          <w:szCs w:val="21"/>
+          <w:bdr w:val="single" w:sz="2" w:space="0" w:color="auto" w:frame="1"/>
+        </w:rPr>
+        <w:t>File</w:t>
+      </w:r>
+      <w:r>
+        <w:rPr>
+          <w:rFonts w:ascii="Segoe UI" w:hAnsi="Segoe UI" w:cs="Segoe UI"/>
+          <w:color w:val="171717"/>
+          <w:sz w:val="21"/>
+          <w:szCs w:val="21"/>
+        </w:rPr>
+        <w:t> (top-left corner) → </w:t>
+      </w:r>
+      <w:r>
+        <w:rPr>
+          <w:rStyle w:val="Strong"/>
+          <w:rFonts w:ascii="Segoe UI" w:hAnsi="Segoe UI" w:cs="Segoe UI"/>
+          <w:b w:val="0"/>
+          <w:bCs w:val="0"/>
+          <w:color w:val="171717"/>
+          <w:sz w:val="21"/>
+          <w:szCs w:val="21"/>
+          <w:bdr w:val="single" w:sz="2" w:space="0" w:color="auto" w:frame="1"/>
+        </w:rPr>
+        <w:t>"Add Local Repository"</w:t>
+      </w:r>
+    </w:p>
+    <w:p>
+      <w:pPr>
+        <w:pStyle w:val="NormalWeb"/>
+        <w:numPr>
+          <w:ilvl w:val="0"/>
+          <w:numId w:val="13"/>
+        </w:numPr>
+        <w:pBdr>
+          <w:top w:val="single" w:sz="2" w:space="0" w:color="auto"/>
+          <w:left w:val="single" w:sz="2" w:space="0" w:color="auto"/>
+          <w:bottom w:val="single" w:sz="2" w:space="0" w:color="auto"/>
+          <w:right w:val="single" w:sz="2" w:space="0" w:color="auto"/>
+        </w:pBdr>
+        <w:shd w:val="clear" w:color="auto" w:fill="FCFCFC"/>
+        <w:spacing w:before="0" w:beforeAutospacing="0" w:after="0" w:afterAutospacing="0"/>
+        <w:ind w:left="0"/>
+        <w:rPr>
+          <w:rFonts w:ascii="Segoe UI" w:hAnsi="Segoe UI" w:cs="Segoe UI"/>
+          <w:color w:val="171717"/>
+          <w:sz w:val="21"/>
+          <w:szCs w:val="21"/>
+        </w:rPr>
+      </w:pPr>
+      <w:r>
+        <w:rPr>
+          <w:rFonts w:ascii="Segoe UI" w:hAnsi="Segoe UI" w:cs="Segoe UI"/>
+          <w:color w:val="171717"/>
+          <w:sz w:val="21"/>
+          <w:szCs w:val="21"/>
+        </w:rPr>
+        <w:t>Click </w:t>
+      </w:r>
+      <w:r>
+        <w:rPr>
+          <w:rStyle w:val="Strong"/>
+          <w:rFonts w:ascii="Segoe UI" w:hAnsi="Segoe UI" w:cs="Segoe UI"/>
+          <w:b w:val="0"/>
+          <w:bCs w:val="0"/>
+          <w:color w:val="171717"/>
+          <w:sz w:val="21"/>
+          <w:szCs w:val="21"/>
+          <w:bdr w:val="single" w:sz="2" w:space="0" w:color="auto" w:frame="1"/>
+        </w:rPr>
+        <w:t>"Choose"</w:t>
+      </w:r>
+      <w:r>
+        <w:rPr>
+          <w:rFonts w:ascii="Segoe UI" w:hAnsi="Segoe UI" w:cs="Segoe UI"/>
+          <w:color w:val="171717"/>
+          <w:sz w:val="21"/>
+          <w:szCs w:val="21"/>
+        </w:rPr>
+        <w:t> and navigate to:</w:t>
+      </w:r>
+    </w:p>
+    <w:p>
+      <w:pPr>
+        <w:pStyle w:val="HTMLPreformatted"/>
+        <w:pBdr>
+          <w:top w:val="single" w:sz="4" w:space="9" w:color="DBDBDB"/>
+          <w:left w:val="single" w:sz="4" w:space="9" w:color="DBDBDB"/>
+          <w:bottom w:val="single" w:sz="4" w:space="9" w:color="DBDBDB"/>
+          <w:right w:val="single" w:sz="4" w:space="9" w:color="DBDBDB"/>
+        </w:pBdr>
+        <w:shd w:val="clear" w:color="auto" w:fill="FCFCFC"/>
+        <w:rPr>
+          <w:rFonts w:ascii="Consolas" w:hAnsi="Consolas"/>
+          <w:color w:val="6F6F6F"/>
+        </w:rPr>
+      </w:pPr>
+      <w:r>
+        <w:rPr>
+          <w:rStyle w:val="line"/>
+          <w:rFonts w:ascii="Consolas" w:hAnsi="Consolas"/>
+          <w:color w:val="6F6F6F"/>
+          <w:bdr w:val="single" w:sz="2" w:space="0" w:color="auto" w:frame="1"/>
+        </w:rPr>
+        <w:t>C:\Users\Orelson\AppData\Local\Temp\opencode\taskmaster</w:t>
+      </w:r>
+    </w:p>
+    <w:p>
+      <w:pPr>
+        <w:pStyle w:val="NormalWeb"/>
+        <w:numPr>
+          <w:ilvl w:val="0"/>
+          <w:numId w:val="13"/>
+        </w:numPr>
+        <w:pBdr>
+          <w:top w:val="single" w:sz="2" w:space="0" w:color="auto"/>
+          <w:left w:val="single" w:sz="2" w:space="0" w:color="auto"/>
+          <w:bottom w:val="single" w:sz="2" w:space="0" w:color="auto"/>
+          <w:right w:val="single" w:sz="2" w:space="0" w:color="auto"/>
+        </w:pBdr>
+        <w:shd w:val="clear" w:color="auto" w:fill="FCFCFC"/>
+        <w:spacing w:before="0" w:beforeAutospacing="0" w:after="0" w:afterAutospacing="0"/>
+        <w:ind w:left="0"/>
+        <w:rPr>
+          <w:rFonts w:ascii="Segoe UI" w:hAnsi="Segoe UI" w:cs="Segoe UI"/>
+          <w:color w:val="171717"/>
+          <w:sz w:val="21"/>
+          <w:szCs w:val="21"/>
+        </w:rPr>
+      </w:pPr>
+      <w:r>
+        <w:rPr>
+          <w:rFonts w:ascii="Segoe UI" w:hAnsi="Segoe UI" w:cs="Segoe UI"/>
+          <w:color w:val="171717"/>
+          <w:sz w:val="21"/>
+          <w:szCs w:val="21"/>
+        </w:rPr>
+        <w:t>Click </w:t>
+      </w:r>
+      <w:r>
+        <w:rPr>
+          <w:rStyle w:val="Strong"/>
+          <w:rFonts w:ascii="Segoe UI" w:hAnsi="Segoe UI" w:cs="Segoe UI"/>
+          <w:b w:val="0"/>
+          <w:bCs w:val="0"/>
+          <w:color w:val="171717"/>
+          <w:sz w:val="21"/>
+          <w:szCs w:val="21"/>
+          <w:bdr w:val="single" w:sz="2" w:space="0" w:color="auto" w:frame="1"/>
+        </w:rPr>
+        <w:t>"Select Folder"</w:t>
+      </w:r>
+    </w:p>
+    <w:p>
+      <w:pPr>
+        <w:pStyle w:val="NormalWeb"/>
+        <w:numPr>
+          <w:ilvl w:val="0"/>
+          <w:numId w:val="13"/>
+        </w:numPr>
+        <w:pBdr>
+          <w:top w:val="single" w:sz="2" w:space="0" w:color="auto"/>
+          <w:left w:val="single" w:sz="2" w:space="0" w:color="auto"/>
+          <w:bottom w:val="single" w:sz="2" w:space="0" w:color="auto"/>
+          <w:right w:val="single" w:sz="2" w:space="0" w:color="auto"/>
+        </w:pBdr>
+        <w:shd w:val="clear" w:color="auto" w:fill="FCFCFC"/>
+        <w:spacing w:before="0" w:beforeAutospacing="0" w:after="0" w:afterAutospacing="0"/>
+        <w:ind w:left="0"/>
+        <w:rPr>
+          <w:rFonts w:ascii="Segoe UI" w:hAnsi="Segoe UI" w:cs="Segoe UI"/>
+          <w:color w:val="171717"/>
+          <w:sz w:val="21"/>
+          <w:szCs w:val="21"/>
+        </w:rPr>
+      </w:pPr>
+      <w:r>
+        <w:rPr>
+          <w:rFonts w:ascii="Segoe UI" w:hAnsi="Segoe UI" w:cs="Segoe UI"/>
+          <w:color w:val="171717"/>
+          <w:sz w:val="21"/>
+          <w:szCs w:val="21"/>
+        </w:rPr>
+        <w:t>Click </w:t>
+      </w:r>
+      <w:r>
+        <w:rPr>
+          <w:rStyle w:val="Strong"/>
+          <w:rFonts w:ascii="Segoe UI" w:hAnsi="Segoe UI" w:cs="Segoe UI"/>
+          <w:b w:val="0"/>
+          <w:bCs w:val="0"/>
+          <w:color w:val="171717"/>
+          <w:sz w:val="21"/>
+          <w:szCs w:val="21"/>
+          <w:bdr w:val="single" w:sz="2" w:space="0" w:color="auto" w:frame="1"/>
+        </w:rPr>
+        <w:t>"Add Repository"</w:t>
+      </w:r>
+    </w:p>
+    <w:p>
+      <w:pPr>
+        <w:pStyle w:val="NormalWeb"/>
+        <w:pBdr>
+          <w:top w:val="single" w:sz="2" w:space="0" w:color="auto"/>
+          <w:left w:val="single" w:sz="2" w:space="0" w:color="auto"/>
+          <w:bottom w:val="single" w:sz="2" w:space="0" w:color="auto"/>
+          <w:right w:val="single" w:sz="2" w:space="0" w:color="auto"/>
+        </w:pBdr>
+        <w:shd w:val="clear" w:color="auto" w:fill="FCFCFC"/>
+        <w:spacing w:before="0" w:beforeAutospacing="0" w:after="180" w:afterAutospacing="0"/>
+        <w:rPr>
+          <w:rFonts w:ascii="Segoe UI" w:hAnsi="Segoe UI" w:cs="Segoe UI"/>
+          <w:color w:val="171717"/>
+          <w:sz w:val="21"/>
+          <w:szCs w:val="21"/>
+        </w:rPr>
+      </w:pPr>
+      <w:r>
+        <w:rPr>
+          <w:rFonts w:ascii="Segoe UI" w:hAnsi="Segoe UI" w:cs="Segoe UI"/>
+          <w:color w:val="171717"/>
+          <w:sz w:val="21"/>
+          <w:szCs w:val="21"/>
+        </w:rPr>
+        <w:t>You'll see a screen like this:</w:t>
+      </w:r>
+    </w:p>
+    <w:p>
+      <w:pPr>
+        <w:pStyle w:val="NormalWeb"/>
+        <w:pBdr>
+          <w:top w:val="single" w:sz="2" w:space="0" w:color="auto"/>
+          <w:left w:val="single" w:sz="2" w:space="0" w:color="auto"/>
+          <w:bottom w:val="single" w:sz="2" w:space="0" w:color="auto"/>
+          <w:right w:val="single" w:sz="2" w:space="0" w:color="auto"/>
+        </w:pBdr>
+        <w:shd w:val="clear" w:color="auto" w:fill="FCFCFC"/>
+        <w:spacing w:before="0" w:beforeAutospacing="0" w:after="180" w:afterAutospacing="0"/>
+        <w:rPr>
+          <w:rFonts w:ascii="Segoe UI" w:hAnsi="Segoe UI" w:cs="Segoe UI"/>
+          <w:color w:val="171717"/>
+          <w:sz w:val="21"/>
+          <w:szCs w:val="21"/>
+        </w:rPr>
+      </w:pPr>
+      <w:r>
+        <w:rPr>
+          <w:rFonts w:ascii="Segoe UI" w:hAnsi="Segoe UI" w:cs="Segoe UI"/>
+          <w:color w:val="171717"/>
+          <w:sz w:val="21"/>
+          <w:szCs w:val="21"/>
+        </w:rPr>
+        <w:t>![A list of all your files]</w:t>
+      </w:r>
+    </w:p>
+    <w:p>
+      <w:pPr>
+        <w:numPr>
+          <w:ilvl w:val="0"/>
+          <w:numId w:val="14"/>
+        </w:numPr>
+        <w:pBdr>
+          <w:top w:val="single" w:sz="2" w:space="0" w:color="auto"/>
+          <w:left w:val="single" w:sz="2" w:space="0" w:color="auto"/>
+          <w:bottom w:val="single" w:sz="2" w:space="0" w:color="auto"/>
+          <w:right w:val="single" w:sz="2" w:space="0" w:color="auto"/>
+        </w:pBdr>
+        <w:shd w:val="clear" w:color="auto" w:fill="FCFCFC"/>
+        <w:spacing w:after="0" w:line="240" w:lineRule="auto"/>
+        <w:ind w:left="0"/>
+        <w:rPr>
+          <w:rFonts w:ascii="Segoe UI" w:hAnsi="Segoe UI" w:cs="Segoe UI"/>
+          <w:color w:val="171717"/>
+          <w:sz w:val="21"/>
+          <w:szCs w:val="21"/>
+        </w:rPr>
+      </w:pPr>
+      <w:r>
+        <w:rPr>
+          <w:rFonts w:ascii="Segoe UI" w:hAnsi="Segoe UI" w:cs="Segoe UI"/>
+          <w:color w:val="171717"/>
+          <w:sz w:val="21"/>
+          <w:szCs w:val="21"/>
+        </w:rPr>
+        <w:t>At the bottom-left, there's a box that says </w:t>
+      </w:r>
+      <w:r>
+        <w:rPr>
+          <w:rStyle w:val="Strong"/>
+          <w:rFonts w:ascii="Segoe UI" w:hAnsi="Segoe UI" w:cs="Segoe UI"/>
+          <w:b w:val="0"/>
+          <w:bCs w:val="0"/>
+          <w:color w:val="171717"/>
+          <w:sz w:val="21"/>
+          <w:szCs w:val="21"/>
+          <w:bdr w:val="single" w:sz="2" w:space="0" w:color="auto" w:frame="1"/>
+        </w:rPr>
+        <w:t>"Summary (required)"</w:t>
+      </w:r>
+    </w:p>
+    <w:p>
+      <w:pPr>
+        <w:numPr>
+          <w:ilvl w:val="0"/>
+          <w:numId w:val="14"/>
+        </w:numPr>
+        <w:pBdr>
+          <w:top w:val="single" w:sz="2" w:space="0" w:color="auto"/>
+          <w:left w:val="single" w:sz="2" w:space="0" w:color="auto"/>
+          <w:bottom w:val="single" w:sz="2" w:space="0" w:color="auto"/>
+          <w:right w:val="single" w:sz="2" w:space="0" w:color="auto"/>
+        </w:pBdr>
+        <w:shd w:val="clear" w:color="auto" w:fill="FCFCFC"/>
+        <w:spacing w:after="0" w:line="240" w:lineRule="auto"/>
+        <w:ind w:left="0"/>
+        <w:rPr>
+          <w:rFonts w:ascii="Segoe UI" w:hAnsi="Segoe UI" w:cs="Segoe UI"/>
+          <w:color w:val="171717"/>
+          <w:sz w:val="21"/>
+          <w:szCs w:val="21"/>
+        </w:rPr>
+      </w:pPr>
+      <w:r>
+        <w:rPr>
+          <w:rFonts w:ascii="Segoe UI" w:hAnsi="Segoe UI" w:cs="Segoe UI"/>
+          <w:color w:val="171717"/>
+          <w:sz w:val="21"/>
+          <w:szCs w:val="21"/>
+        </w:rPr>
+        <w:t>Type in it: </w:t>
+      </w:r>
+      <w:r>
+        <w:rPr>
+          <w:rStyle w:val="HTMLCode"/>
+          <w:rFonts w:ascii="Consolas" w:eastAsiaTheme="minorHAnsi" w:hAnsi="Consolas"/>
+          <w:color w:val="00CEB9"/>
+          <w:sz w:val="21"/>
+          <w:szCs w:val="21"/>
+          <w:bdr w:val="single" w:sz="2" w:space="0" w:color="auto" w:frame="1"/>
+        </w:rPr>
+        <w:t>first upload</w:t>
+      </w:r>
+    </w:p>
+    <w:p>
+      <w:pPr>
+        <w:numPr>
+          <w:ilvl w:val="0"/>
+          <w:numId w:val="14"/>
+        </w:numPr>
+        <w:pBdr>
+          <w:top w:val="single" w:sz="2" w:space="0" w:color="auto"/>
+          <w:left w:val="single" w:sz="2" w:space="0" w:color="auto"/>
+          <w:bottom w:val="single" w:sz="2" w:space="0" w:color="auto"/>
+          <w:right w:val="single" w:sz="2" w:space="0" w:color="auto"/>
+        </w:pBdr>
+        <w:shd w:val="clear" w:color="auto" w:fill="FCFCFC"/>
+        <w:spacing w:after="0" w:line="240" w:lineRule="auto"/>
+        <w:ind w:left="0"/>
+        <w:rPr>
+          <w:rFonts w:ascii="Segoe UI" w:hAnsi="Segoe UI" w:cs="Segoe UI"/>
+          <w:color w:val="171717"/>
+          <w:sz w:val="21"/>
+          <w:szCs w:val="21"/>
+        </w:rPr>
+      </w:pPr>
+      <w:r>
+        <w:rPr>
+          <w:rFonts w:ascii="Segoe UI" w:hAnsi="Segoe UI" w:cs="Segoe UI"/>
+          <w:color w:val="171717"/>
+          <w:sz w:val="21"/>
+          <w:szCs w:val="21"/>
+        </w:rPr>
+        <w:t>Click the blue </w:t>
+      </w:r>
+      <w:r>
+        <w:rPr>
+          <w:rStyle w:val="Strong"/>
+          <w:rFonts w:ascii="Segoe UI" w:hAnsi="Segoe UI" w:cs="Segoe UI"/>
+          <w:b w:val="0"/>
+          <w:bCs w:val="0"/>
+          <w:color w:val="171717"/>
+          <w:sz w:val="21"/>
+          <w:szCs w:val="21"/>
+          <w:bdr w:val="single" w:sz="2" w:space="0" w:color="auto" w:frame="1"/>
+        </w:rPr>
+        <w:t>"Commit to main"</w:t>
+      </w:r>
+      <w:r>
+        <w:rPr>
+          <w:rFonts w:ascii="Segoe UI" w:hAnsi="Segoe UI" w:cs="Segoe UI"/>
+          <w:color w:val="171717"/>
+          <w:sz w:val="21"/>
+          <w:szCs w:val="21"/>
+        </w:rPr>
+        <w:t> button</w:t>
+      </w:r>
+    </w:p>
+    <w:p>
+      <w:pPr>
+        <w:pStyle w:val="NormalWeb"/>
+        <w:pBdr>
+          <w:top w:val="single" w:sz="2" w:space="0" w:color="auto"/>
+          <w:left w:val="single" w:sz="2" w:space="0" w:color="auto"/>
+          <w:bottom w:val="single" w:sz="2" w:space="0" w:color="auto"/>
+          <w:right w:val="single" w:sz="2" w:space="0" w:color="auto"/>
+        </w:pBdr>
+        <w:shd w:val="clear" w:color="auto" w:fill="FCFCFC"/>
+        <w:spacing w:before="0" w:beforeAutospacing="0" w:after="180" w:afterAutospacing="0"/>
+        <w:rPr>
+          <w:rFonts w:ascii="Segoe UI" w:hAnsi="Segoe UI" w:cs="Segoe UI"/>
+          <w:color w:val="171717"/>
+          <w:sz w:val="21"/>
+          <w:szCs w:val="21"/>
+        </w:rPr>
+      </w:pPr>
+      <w:r>
+        <w:rPr>
+          <w:rFonts w:ascii="Segoe UI" w:hAnsi="Segoe UI" w:cs="Segoe UI"/>
+          <w:color w:val="171717"/>
+          <w:sz w:val="21"/>
+          <w:szCs w:val="21"/>
+        </w:rPr>
+        <w:t>Now you need to send it to GitHub:</w:t>
+      </w:r>
+    </w:p>
+    <w:p>
+      <w:pPr>
+        <w:numPr>
+          <w:ilvl w:val="0"/>
+          <w:numId w:val="15"/>
+        </w:numPr>
+        <w:pBdr>
+          <w:top w:val="single" w:sz="2" w:space="0" w:color="auto"/>
+          <w:left w:val="single" w:sz="2" w:space="0" w:color="auto"/>
+          <w:bottom w:val="single" w:sz="2" w:space="0" w:color="auto"/>
+          <w:right w:val="single" w:sz="2" w:space="0" w:color="auto"/>
+        </w:pBdr>
+        <w:shd w:val="clear" w:color="auto" w:fill="FCFCFC"/>
+        <w:spacing w:after="0" w:line="240" w:lineRule="auto"/>
+        <w:ind w:left="0"/>
+        <w:rPr>
+          <w:rFonts w:ascii="Segoe UI" w:hAnsi="Segoe UI" w:cs="Segoe UI"/>
+          <w:color w:val="171717"/>
+          <w:sz w:val="21"/>
+          <w:szCs w:val="21"/>
+        </w:rPr>
+      </w:pPr>
+      <w:r>
+        <w:rPr>
+          <w:rFonts w:ascii="Segoe UI" w:hAnsi="Segoe UI" w:cs="Segoe UI"/>
+          <w:color w:val="171717"/>
+          <w:sz w:val="21"/>
+          <w:szCs w:val="21"/>
+        </w:rPr>
+        <w:t>Click the blue </w:t>
+      </w:r>
+      <w:r>
+        <w:rPr>
+          <w:rStyle w:val="Strong"/>
+          <w:rFonts w:ascii="Segoe UI" w:hAnsi="Segoe UI" w:cs="Segoe UI"/>
+          <w:b w:val="0"/>
+          <w:bCs w:val="0"/>
+          <w:color w:val="171717"/>
+          <w:sz w:val="21"/>
+          <w:szCs w:val="21"/>
+          <w:bdr w:val="single" w:sz="2" w:space="0" w:color="auto" w:frame="1"/>
+        </w:rPr>
+        <w:t>"Publish repository"</w:t>
+      </w:r>
+      <w:r>
+        <w:rPr>
+          <w:rFonts w:ascii="Segoe UI" w:hAnsi="Segoe UI" w:cs="Segoe UI"/>
+          <w:color w:val="171717"/>
+          <w:sz w:val="21"/>
+          <w:szCs w:val="21"/>
+        </w:rPr>
+        <w:t> button at the top</w:t>
+      </w:r>
+    </w:p>
+    <w:p>
+      <w:pPr>
+        <w:numPr>
+          <w:ilvl w:val="0"/>
+          <w:numId w:val="15"/>
+        </w:numPr>
+        <w:pBdr>
+          <w:top w:val="single" w:sz="2" w:space="0" w:color="auto"/>
+          <w:left w:val="single" w:sz="2" w:space="0" w:color="auto"/>
+          <w:bottom w:val="single" w:sz="2" w:space="0" w:color="auto"/>
+          <w:right w:val="single" w:sz="2" w:space="0" w:color="auto"/>
+        </w:pBdr>
+        <w:shd w:val="clear" w:color="auto" w:fill="FCFCFC"/>
+        <w:spacing w:after="0" w:line="240" w:lineRule="auto"/>
+        <w:ind w:left="0"/>
+        <w:rPr>
+          <w:rFonts w:ascii="Segoe UI" w:hAnsi="Segoe UI" w:cs="Segoe UI"/>
+          <w:color w:val="171717"/>
+          <w:sz w:val="21"/>
+          <w:szCs w:val="21"/>
+        </w:rPr>
+      </w:pPr>
+      <w:r>
+        <w:rPr>
+          <w:rFonts w:ascii="Segoe UI" w:hAnsi="Segoe UI" w:cs="Segoe UI"/>
+          <w:color w:val="171717"/>
+          <w:sz w:val="21"/>
+          <w:szCs w:val="21"/>
+        </w:rPr>
+        <w:t>Make sure </w:t>
+      </w:r>
+      <w:r>
+        <w:rPr>
+          <w:rStyle w:val="Strong"/>
+          <w:rFonts w:ascii="Segoe UI" w:hAnsi="Segoe UI" w:cs="Segoe UI"/>
+          <w:b w:val="0"/>
+          <w:bCs w:val="0"/>
+          <w:color w:val="171717"/>
+          <w:sz w:val="21"/>
+          <w:szCs w:val="21"/>
+          <w:bdr w:val="single" w:sz="2" w:space="0" w:color="auto" w:frame="1"/>
+        </w:rPr>
+        <w:t>"Keep this code private"</w:t>
+      </w:r>
+      <w:r>
+        <w:rPr>
+          <w:rFonts w:ascii="Segoe UI" w:hAnsi="Segoe UI" w:cs="Segoe UI"/>
+          <w:color w:val="171717"/>
+          <w:sz w:val="21"/>
+          <w:szCs w:val="21"/>
+        </w:rPr>
+        <w:t> is </w:t>
+      </w:r>
+      <w:r>
+        <w:rPr>
+          <w:rStyle w:val="Strong"/>
+          <w:rFonts w:ascii="Segoe UI" w:hAnsi="Segoe UI" w:cs="Segoe UI"/>
+          <w:b w:val="0"/>
+          <w:bCs w:val="0"/>
+          <w:color w:val="171717"/>
+          <w:sz w:val="21"/>
+          <w:szCs w:val="21"/>
+          <w:bdr w:val="single" w:sz="2" w:space="0" w:color="auto" w:frame="1"/>
+        </w:rPr>
+        <w:t>NOT checked</w:t>
+      </w:r>
+      <w:r>
+        <w:rPr>
+          <w:rFonts w:ascii="Segoe UI" w:hAnsi="Segoe UI" w:cs="Segoe UI"/>
+          <w:color w:val="171717"/>
+          <w:sz w:val="21"/>
+          <w:szCs w:val="21"/>
+        </w:rPr>
+        <w:t> (uncheck it so it's public)</w:t>
+      </w:r>
+    </w:p>
+    <w:p>
+      <w:pPr>
+        <w:numPr>
+          <w:ilvl w:val="0"/>
+          <w:numId w:val="15"/>
+        </w:numPr>
+        <w:pBdr>
+          <w:top w:val="single" w:sz="2" w:space="0" w:color="auto"/>
+          <w:left w:val="single" w:sz="2" w:space="0" w:color="auto"/>
+          <w:bottom w:val="single" w:sz="2" w:space="0" w:color="auto"/>
+          <w:right w:val="single" w:sz="2" w:space="0" w:color="auto"/>
+        </w:pBdr>
+        <w:shd w:val="clear" w:color="auto" w:fill="FCFCFC"/>
+        <w:spacing w:after="0" w:line="240" w:lineRule="auto"/>
+        <w:ind w:left="0"/>
+        <w:rPr>
+          <w:rFonts w:ascii="Segoe UI" w:hAnsi="Segoe UI" w:cs="Segoe UI"/>
+          <w:color w:val="171717"/>
+          <w:sz w:val="21"/>
+          <w:szCs w:val="21"/>
+        </w:rPr>
+      </w:pPr>
+      <w:r>
+        <w:rPr>
+          <w:rFonts w:ascii="Segoe UI" w:hAnsi="Segoe UI" w:cs="Segoe UI"/>
+          <w:color w:val="171717"/>
+          <w:sz w:val="21"/>
+          <w:szCs w:val="21"/>
+        </w:rPr>
+        <w:t>Click </w:t>
+      </w:r>
+      <w:r>
+        <w:rPr>
+          <w:rStyle w:val="Strong"/>
+          <w:rFonts w:ascii="Segoe UI" w:hAnsi="Segoe UI" w:cs="Segoe UI"/>
+          <w:b w:val="0"/>
+          <w:bCs w:val="0"/>
+          <w:color w:val="171717"/>
+          <w:sz w:val="21"/>
+          <w:szCs w:val="21"/>
+          <w:bdr w:val="single" w:sz="2" w:space="0" w:color="auto" w:frame="1"/>
+        </w:rPr>
+        <w:t>"Publish Repository"</w:t>
+      </w:r>
+    </w:p>
+    <w:p>
+      <w:pPr>
+        <w:pStyle w:val="NormalWeb"/>
+        <w:pBdr>
+          <w:top w:val="single" w:sz="2" w:space="0" w:color="auto"/>
+          <w:left w:val="single" w:sz="2" w:space="0" w:color="auto"/>
+          <w:bottom w:val="single" w:sz="2" w:space="0" w:color="auto"/>
+          <w:right w:val="single" w:sz="2" w:space="0" w:color="auto"/>
+        </w:pBdr>
+        <w:shd w:val="clear" w:color="auto" w:fill="FCFCFC"/>
+        <w:spacing w:before="0" w:beforeAutospacing="0" w:after="180" w:afterAutospacing="0"/>
+        <w:rPr>
+          <w:rFonts w:ascii="Segoe UI" w:hAnsi="Segoe UI" w:cs="Segoe UI"/>
+          <w:color w:val="171717"/>
+          <w:sz w:val="21"/>
+          <w:szCs w:val="21"/>
+        </w:rPr>
+      </w:pPr>
+      <w:r>
+        <w:rPr>
+          <w:rFonts w:ascii="Segoe UI" w:hAnsi="Segoe UI" w:cs="Segoe UI"/>
+          <w:color w:val="171717"/>
+          <w:sz w:val="21"/>
+          <w:szCs w:val="21"/>
+        </w:rPr>
+        <w:t xml:space="preserve">Done! </w:t>
+      </w:r>
+      <w:r>
+        <w:rPr>
+          <w:rFonts w:ascii="Segoe UI Emoji" w:hAnsi="Segoe UI Emoji" w:cs="Segoe UI Emoji"/>
+          <w:color w:val="171717"/>
+          <w:sz w:val="21"/>
+          <w:szCs w:val="21"/>
+        </w:rPr>
+        <w:t>🎉</w:t>
+      </w:r>
+      <w:r>
+        <w:rPr>
+          <w:rFonts w:ascii="Segoe UI" w:hAnsi="Segoe UI" w:cs="Segoe UI"/>
+          <w:color w:val="171717"/>
+          <w:sz w:val="21"/>
+          <w:szCs w:val="21"/>
+        </w:rPr>
+        <w:t xml:space="preserve"> Your code is now on GitHub!</w:t>
+      </w:r>
+    </w:p>
+    <w:p>
+      <w:pPr>
+        <w:pStyle w:val="Heading2"/>
+        <w:pBdr>
+          <w:top w:val="single" w:sz="2" w:space="0" w:color="auto"/>
+          <w:left w:val="single" w:sz="2" w:space="0" w:color="auto"/>
+          <w:bottom w:val="single" w:sz="2" w:space="0" w:color="auto"/>
+          <w:right w:val="single" w:sz="2" w:space="0" w:color="auto"/>
+        </w:pBdr>
+        <w:shd w:val="clear" w:color="auto" w:fill="FCFCFC"/>
+        <w:spacing w:before="0" w:beforeAutospacing="0" w:after="360" w:afterAutospacing="0" w:line="315" w:lineRule="atLeast"/>
+        <w:rPr>
+          <w:rFonts w:ascii="Segoe UI" w:hAnsi="Segoe UI" w:cs="Segoe UI"/>
+          <w:b w:val="0"/>
+          <w:bCs w:val="0"/>
+          <w:color w:val="171717"/>
+          <w:sz w:val="21"/>
+          <w:szCs w:val="21"/>
+        </w:rPr>
+      </w:pPr>
+      <w:r>
+        <w:rPr>
+          <w:rFonts w:ascii="Segoe UI" w:hAnsi="Segoe UI" w:cs="Segoe UI"/>
+          <w:b w:val="0"/>
+          <w:bCs w:val="0"/>
+          <w:color w:val="171717"/>
+          <w:sz w:val="21"/>
+          <w:szCs w:val="21"/>
+        </w:rPr>
+        <w:t>Step 4: Deploy on Render</w:t>
+      </w:r>
+    </w:p>
+    <w:p>
+      <w:pPr>
+        <w:pStyle w:val="NormalWeb"/>
+        <w:pBdr>
+          <w:top w:val="single" w:sz="2" w:space="0" w:color="auto"/>
+          <w:left w:val="single" w:sz="2" w:space="0" w:color="auto"/>
+          <w:bottom w:val="single" w:sz="2" w:space="0" w:color="auto"/>
+          <w:right w:val="single" w:sz="2" w:space="0" w:color="auto"/>
+        </w:pBdr>
+        <w:shd w:val="clear" w:color="auto" w:fill="FCFCFC"/>
+        <w:spacing w:before="0" w:beforeAutospacing="0" w:after="0" w:afterAutospacing="0"/>
+        <w:rPr>
+          <w:rFonts w:ascii="Segoe UI" w:hAnsi="Segoe UI" w:cs="Segoe UI"/>
+          <w:color w:val="171717"/>
+          <w:sz w:val="21"/>
+          <w:szCs w:val="21"/>
+        </w:rPr>
+      </w:pPr>
+      <w:r>
+        <w:rPr>
+          <w:rFonts w:ascii="Segoe UI" w:hAnsi="Segoe UI" w:cs="Segoe UI"/>
+          <w:color w:val="171717"/>
+          <w:sz w:val="21"/>
+          <w:szCs w:val="21"/>
+        </w:rPr>
+        <w:t>Now go back to my previous instructions at </w:t>
+      </w:r>
+      <w:r>
+        <w:rPr>
+          <w:rStyle w:val="Strong"/>
+          <w:rFonts w:ascii="Segoe UI" w:hAnsi="Segoe UI" w:cs="Segoe UI"/>
+          <w:b w:val="0"/>
+          <w:bCs w:val="0"/>
+          <w:color w:val="171717"/>
+          <w:sz w:val="21"/>
+          <w:szCs w:val="21"/>
+          <w:bdr w:val="single" w:sz="2" w:space="0" w:color="auto" w:frame="1"/>
+        </w:rPr>
+        <w:t>Part 2: Deploy on Render</w:t>
+      </w:r>
+      <w:r>
+        <w:rPr>
+          <w:rFonts w:ascii="Segoe UI" w:hAnsi="Segoe UI" w:cs="Segoe UI"/>
+          <w:color w:val="171717"/>
+          <w:sz w:val="21"/>
+          <w:szCs w:val="21"/>
+        </w:rPr>
+        <w:t> and continue from there.</w:t>
+      </w:r>
+    </w:p>
+    <w:p>
+      <w:pPr>
+        <w:pStyle w:val="NormalWeb"/>
+        <w:pBdr>
+          <w:top w:val="single" w:sz="2" w:space="0" w:color="auto"/>
+          <w:left w:val="single" w:sz="2" w:space="0" w:color="auto"/>
+          <w:bottom w:val="single" w:sz="2" w:space="0" w:color="auto"/>
+          <w:right w:val="single" w:sz="2" w:space="0" w:color="auto"/>
+        </w:pBdr>
+        <w:shd w:val="clear" w:color="auto" w:fill="FCFCFC"/>
+        <w:spacing w:before="0" w:beforeAutospacing="0" w:after="0" w:afterAutospacing="0"/>
+        <w:rPr>
+          <w:rFonts w:ascii="Segoe UI" w:hAnsi="Segoe UI" w:cs="Segoe UI"/>
+          <w:color w:val="171717"/>
+          <w:sz w:val="21"/>
+          <w:szCs w:val="21"/>
+        </w:rPr>
+      </w:pPr>
+      <w:r>
+        <w:rPr>
+          <w:rFonts w:ascii="Segoe UI" w:hAnsi="Segoe UI" w:cs="Segoe UI"/>
+          <w:color w:val="171717"/>
+          <w:sz w:val="21"/>
+          <w:szCs w:val="21"/>
+        </w:rPr>
+        <w:t>When you get to the step where it says "Connect your GitHub repo", Render will show you your </w:t>
+      </w:r>
+      <w:r>
+        <w:rPr>
+          <w:rStyle w:val="HTMLCode"/>
+          <w:rFonts w:ascii="Consolas" w:hAnsi="Consolas"/>
+          <w:color w:val="00CEB9"/>
+          <w:sz w:val="21"/>
+          <w:szCs w:val="21"/>
+          <w:bdr w:val="single" w:sz="2" w:space="0" w:color="auto" w:frame="1"/>
+        </w:rPr>
+        <w:t>taskmaster</w:t>
+      </w:r>
+      <w:r>
+        <w:rPr>
+          <w:rFonts w:ascii="Segoe UI" w:hAnsi="Segoe UI" w:cs="Segoe UI"/>
+          <w:color w:val="171717"/>
+          <w:sz w:val="21"/>
+          <w:szCs w:val="21"/>
+        </w:rPr>
+        <w:t> repo — just click the "Connect" button next to it.</w:t>
+      </w:r>
+    </w:p>
+    <w:p>
+      <w:pPr>
+        <w:spacing w:before="600" w:after="600"/>
+        <w:rPr>
+          <w:rFonts w:ascii="Times New Roman" w:hAnsi="Times New Roman" w:cs="Times New Roman"/>
+          <w:sz w:val="24"/>
+          <w:szCs w:val="24"/>
+        </w:rPr>
+      </w:pPr>
+      <w:r>
+        <w:pict w14:anchorId="7F065E8E">
+          <v:rect id="_x0000_i1028" style="width:0;height:0" o:hralign="center" o:hrstd="t" o:hr="t" fillcolor="#a0a0a0" stroked="f"/>
+        </w:pict>
+      </w:r>
+    </w:p>
+    <w:p>
+      <w:pPr>
+        <w:pStyle w:val="NormalWeb"/>
+        <w:pBdr>
+          <w:top w:val="single" w:sz="2" w:space="0" w:color="auto"/>
+          <w:left w:val="single" w:sz="2" w:space="0" w:color="auto"/>
+          <w:bottom w:val="single" w:sz="2" w:space="0" w:color="auto"/>
+          <w:right w:val="single" w:sz="2" w:space="0" w:color="auto"/>
+        </w:pBdr>
+        <w:shd w:val="clear" w:color="auto" w:fill="FCFCFC"/>
+        <w:spacing w:before="0" w:beforeAutospacing="0" w:after="0" w:afterAutospacing="0"/>
+        <w:rPr>
+          <w:rFonts w:ascii="Segoe UI" w:hAnsi="Segoe UI" w:cs="Segoe UI"/>
+          <w:color w:val="171717"/>
+          <w:sz w:val="21"/>
+          <w:szCs w:val="21"/>
+        </w:rPr>
+      </w:pPr>
+      <w:r>
+        <w:rPr>
+          <w:rStyle w:val="Strong"/>
+          <w:rFonts w:ascii="Segoe UI" w:hAnsi="Segoe UI" w:cs="Segoe UI"/>
+          <w:b w:val="0"/>
+          <w:bCs w:val="0"/>
+          <w:color w:val="171717"/>
+          <w:sz w:val="21"/>
+          <w:szCs w:val="21"/>
+          <w:bdr w:val="single" w:sz="2" w:space="0" w:color="auto" w:frame="1"/>
+        </w:rPr>
+        <w:t>Note:</w:t>
+      </w:r>
+      <w:r>
+        <w:rPr>
+          <w:rFonts w:ascii="Segoe UI" w:hAnsi="Segoe UI" w:cs="Segoe UI"/>
+          <w:color w:val="171717"/>
+          <w:sz w:val="21"/>
+          <w:szCs w:val="21"/>
+        </w:rPr>
+        <w:t> GitHub Desktop remembers your project. Next time you make changes, you just:</w:t>
+      </w:r>
+    </w:p>
+    <w:p>
+      <w:pPr>
+        <w:numPr>
+          <w:ilvl w:val="0"/>
+          <w:numId w:val="16"/>
+        </w:numPr>
+        <w:pBdr>
+          <w:top w:val="single" w:sz="2" w:space="0" w:color="auto"/>
+          <w:left w:val="single" w:sz="2" w:space="0" w:color="auto"/>
+          <w:bottom w:val="single" w:sz="2" w:space="0" w:color="auto"/>
+          <w:right w:val="single" w:sz="2" w:space="0" w:color="auto"/>
+        </w:pBdr>
+        <w:shd w:val="clear" w:color="auto" w:fill="FCFCFC"/>
+        <w:spacing w:after="120" w:line="240" w:lineRule="auto"/>
+        <w:ind w:left="0"/>
+        <w:rPr>
+          <w:rFonts w:ascii="Segoe UI" w:hAnsi="Segoe UI" w:cs="Segoe UI"/>
+          <w:color w:val="171717"/>
+          <w:sz w:val="21"/>
+          <w:szCs w:val="21"/>
+        </w:rPr>
+      </w:pPr>
+      <w:r>
+        <w:rPr>
+          <w:rFonts w:ascii="Segoe UI" w:hAnsi="Segoe UI" w:cs="Segoe UI"/>
+          <w:color w:val="171717"/>
+          <w:sz w:val="21"/>
+          <w:szCs w:val="21"/>
+        </w:rPr>
+        <w:t>Open GitHub Desktop</w:t>
+      </w:r>
+    </w:p>
+    <w:p>
+      <w:pPr>
+        <w:numPr>
+          <w:ilvl w:val="0"/>
+          <w:numId w:val="16"/>
+        </w:numPr>
+        <w:pBdr>
+          <w:top w:val="single" w:sz="2" w:space="0" w:color="auto"/>
+          <w:left w:val="single" w:sz="2" w:space="0" w:color="auto"/>
+          <w:bottom w:val="single" w:sz="2" w:space="0" w:color="auto"/>
+          <w:right w:val="single" w:sz="2" w:space="0" w:color="auto"/>
+        </w:pBdr>
+        <w:shd w:val="clear" w:color="auto" w:fill="FCFCFC"/>
+        <w:spacing w:after="120" w:line="240" w:lineRule="auto"/>
+        <w:ind w:left="0"/>
+        <w:rPr>
+          <w:rFonts w:ascii="Segoe UI" w:hAnsi="Segoe UI" w:cs="Segoe UI"/>
+          <w:color w:val="171717"/>
+          <w:sz w:val="21"/>
+          <w:szCs w:val="21"/>
+        </w:rPr>
+      </w:pPr>
+      <w:r>
+        <w:rPr>
+          <w:rFonts w:ascii="Segoe UI" w:hAnsi="Segoe UI" w:cs="Segoe UI"/>
+          <w:color w:val="171717"/>
+          <w:sz w:val="21"/>
+          <w:szCs w:val="21"/>
+        </w:rPr>
+        <w:t>Type a summary</w:t>
+      </w:r>
+    </w:p>
+    <w:p>
+      <w:pPr>
+        <w:numPr>
+          <w:ilvl w:val="0"/>
+          <w:numId w:val="16"/>
+        </w:numPr>
+        <w:pBdr>
+          <w:top w:val="single" w:sz="2" w:space="0" w:color="auto"/>
+          <w:left w:val="single" w:sz="2" w:space="0" w:color="auto"/>
+          <w:bottom w:val="single" w:sz="2" w:space="0" w:color="auto"/>
+          <w:right w:val="single" w:sz="2" w:space="0" w:color="auto"/>
+        </w:pBdr>
+        <w:shd w:val="clear" w:color="auto" w:fill="FCFCFC"/>
+        <w:spacing w:after="120" w:line="240" w:lineRule="auto"/>
+        <w:ind w:left="0"/>
+        <w:rPr>
+          <w:rFonts w:ascii="Segoe UI" w:hAnsi="Segoe UI" w:cs="Segoe UI"/>
+          <w:color w:val="171717"/>
+          <w:sz w:val="21"/>
+          <w:szCs w:val="21"/>
+        </w:rPr>
+      </w:pPr>
+      <w:r>
+        <w:rPr>
+          <w:rFonts w:ascii="Segoe UI" w:hAnsi="Segoe UI" w:cs="Segoe UI"/>
+          <w:color w:val="171717"/>
+          <w:sz w:val="21"/>
+          <w:szCs w:val="21"/>
+        </w:rPr>
+        <w:t>Click "Commit to main"</w:t>
+      </w:r>
+    </w:p>
+    <w:p>
+      <w:pPr>
+        <w:numPr>
+          <w:ilvl w:val="0"/>
+          <w:numId w:val="16"/>
+        </w:numPr>
+        <w:pBdr>
+          <w:top w:val="single" w:sz="2" w:space="0" w:color="auto"/>
+          <w:left w:val="single" w:sz="2" w:space="0" w:color="auto"/>
+          <w:bottom w:val="single" w:sz="2" w:space="0" w:color="auto"/>
+          <w:right w:val="single" w:sz="2" w:space="0" w:color="auto"/>
+        </w:pBdr>
+        <w:shd w:val="clear" w:color="auto" w:fill="FCFCFC"/>
+        <w:spacing w:after="120" w:line="240" w:lineRule="auto"/>
+        <w:ind w:left="0"/>
+        <w:rPr>
+          <w:rFonts w:ascii="Segoe UI" w:hAnsi="Segoe UI" w:cs="Segoe UI"/>
+          <w:color w:val="171717"/>
+          <w:sz w:val="21"/>
+          <w:szCs w:val="21"/>
+        </w:rPr>
+      </w:pPr>
+      <w:r>
+        <w:rPr>
+          <w:rFonts w:ascii="Segoe UI" w:hAnsi="Segoe UI" w:cs="Segoe UI"/>
+          <w:color w:val="171717"/>
+          <w:sz w:val="21"/>
+          <w:szCs w:val="21"/>
+        </w:rPr>
+        <w:t>Click "Push origin"</w:t>
+      </w:r>
+    </w:p>
+    <w:p>
+      <w:pPr>
+        <w:rPr>
+          <w:lang w:val="en-US"/>
+        </w:rPr>
+      </w:pPr>
       <w:bookmarkStart w:id="0" w:name="_GoBack"/>
       <w:bookmarkEnd w:id="0"/>
     </w:p>
@@ -7195,6 +8823,119 @@
 <file path=word/numbering.xml><?xml version="1.0" encoding="utf-8"?>
 <w:numbering xmlns:wpc="http://schemas.microsoft.com/office/word/2010/wordprocessingCanvas" xmlns:cx="http://schemas.microsoft.com/office/drawing/2014/chartex" xmlns:cx1="http://schemas.microsoft.com/office/drawing/2015/9/8/chartex" xmlns:cx2="http://schemas.microsoft.com/office/drawing/2015/10/21/chartex" xmlns:cx3="http://schemas.microsoft.com/office/drawing/2016/5/9/chartex" xmlns:cx4="http://schemas.microsoft.com/office/drawing/2016/5/10/chartex" xmlns:cx5="http://schemas.microsoft.com/office/drawing/2016/5/11/chartex" xmlns:cx6="http://schemas.microsoft.com/office/drawing/2016/5/12/chartex" xmlns:cx7="http://schemas.microsoft.com/office/drawing/2016/5/13/chartex" xmlns:cx8="http://schemas.microsoft.com/office/drawing/2016/5/14/chartex" xmlns:mc="http://schemas.openxmlformats.org/markup-compatibility/2006" xmlns:aink="http://schemas.microsoft.com/office/drawing/2016/ink" xmlns:am3d="http://schemas.microsoft.com/office/drawing/2017/model3d" xmlns:o="urn:schemas-microsoft-com:office:office" xmlns:r="http://schemas.openxmlformats.org/officeDocument/2006/relationships" xmlns:m="http://schemas.openxmlformats.org/officeDocument/2006/math" xmlns:v="urn:schemas-microsoft-com:vml" xmlns:wp14="http://schemas.microsoft.com/office/word/2010/wordprocessingDrawing" xmlns:wp="http://schemas.openxmlformats.org/drawingml/2006/wordprocessingDrawing" xmlns:w10="urn:schemas-microsoft-com:office:word" xmlns:w="http://schemas.openxmlformats.org/wordprocessingml/2006/main" xmlns:w14="http://schemas.microsoft.com/office/word/2010/wordml" xmlns:w15="http://schemas.microsoft.com/office/word/2012/wordml" xmlns:w16cid="http://schemas.microsoft.com/office/word/2016/wordml/cid" xmlns:w16se="http://schemas.microsoft.com/office/word/2015/wordml/symex" xmlns:wpg="http://schemas.microsoft.com/office/word/2010/wordprocessingGroup" xmlns:wpi="http://schemas.microsoft.com/office/word/2010/wordprocessingInk" xmlns:wne="http://schemas.microsoft.com/office/word/2006/wordml" xmlns:wps="http://schemas.microsoft.com/office/word/2010/wordprocessingShape" mc:Ignorable="w14 w15 w16se w16cid wp14">
   <w:abstractNum w:abstractNumId="0" w15:restartNumberingAfterBreak="0">
+    <w:nsid w:val="075629CF"/>
+    <w:multiLevelType w:val="multilevel"/>
+    <w:tmpl w:val="2D3E1E62"/>
+    <w:lvl w:ilvl="0">
+      <w:start w:val="1"/>
+      <w:numFmt w:val="decimal"/>
+      <w:lvlText w:val="%1."/>
+      <w:lvlJc w:val="left"/>
+      <w:pPr>
+        <w:tabs>
+          <w:tab w:val="num" w:pos="720"/>
+        </w:tabs>
+        <w:ind w:left="720" w:hanging="360"/>
+      </w:pPr>
+    </w:lvl>
+    <w:lvl w:ilvl="1" w:tentative="1">
+      <w:start w:val="1"/>
+      <w:numFmt w:val="decimal"/>
+      <w:lvlText w:val="%2."/>
+      <w:lvlJc w:val="left"/>
+      <w:pPr>
+        <w:tabs>
+          <w:tab w:val="num" w:pos="1440"/>
+        </w:tabs>
+        <w:ind w:left="1440" w:hanging="360"/>
+      </w:pPr>
+    </w:lvl>
+    <w:lvl w:ilvl="2" w:tentative="1">
+      <w:start w:val="1"/>
+      <w:numFmt w:val="decimal"/>
+      <w:lvlText w:val="%3."/>
+      <w:lvlJc w:val="left"/>
+      <w:pPr>
+        <w:tabs>
+          <w:tab w:val="num" w:pos="2160"/>
+        </w:tabs>
+        <w:ind w:left="2160" w:hanging="360"/>
+      </w:pPr>
+    </w:lvl>
+    <w:lvl w:ilvl="3" w:tentative="1">
+      <w:start w:val="1"/>
+      <w:numFmt w:val="decimal"/>
+      <w:lvlText w:val="%4."/>
+      <w:lvlJc w:val="left"/>
+      <w:pPr>
+        <w:tabs>
+          <w:tab w:val="num" w:pos="2880"/>
+        </w:tabs>
+        <w:ind w:left="2880" w:hanging="360"/>
+      </w:pPr>
+    </w:lvl>
+    <w:lvl w:ilvl="4" w:tentative="1">
+      <w:start w:val="1"/>
+      <w:numFmt w:val="decimal"/>
+      <w:lvlText w:val="%5."/>
+      <w:lvlJc w:val="left"/>
+      <w:pPr>
+        <w:tabs>
+          <w:tab w:val="num" w:pos="3600"/>
+        </w:tabs>
+        <w:ind w:left="3600" w:hanging="360"/>
+      </w:pPr>
+    </w:lvl>
+    <w:lvl w:ilvl="5" w:tentative="1">
+      <w:start w:val="1"/>
+      <w:numFmt w:val="decimal"/>
+      <w:lvlText w:val="%6."/>
+      <w:lvlJc w:val="left"/>
+      <w:pPr>
+        <w:tabs>
+          <w:tab w:val="num" w:pos="4320"/>
+        </w:tabs>
+        <w:ind w:left="4320" w:hanging="360"/>
+      </w:pPr>
+    </w:lvl>
+    <w:lvl w:ilvl="6" w:tentative="1">
+      <w:start w:val="1"/>
+      <w:numFmt w:val="decimal"/>
+      <w:lvlText w:val="%7."/>
+      <w:lvlJc w:val="left"/>
+      <w:pPr>
+        <w:tabs>
+          <w:tab w:val="num" w:pos="5040"/>
+        </w:tabs>
+        <w:ind w:left="5040" w:hanging="360"/>
+      </w:pPr>
+    </w:lvl>
+    <w:lvl w:ilvl="7" w:tentative="1">
+      <w:start w:val="1"/>
+      <w:numFmt w:val="decimal"/>
+      <w:lvlText w:val="%8."/>
+      <w:lvlJc w:val="left"/>
+      <w:pPr>
+        <w:tabs>
+          <w:tab w:val="num" w:pos="5760"/>
+        </w:tabs>
+        <w:ind w:left="5760" w:hanging="360"/>
+      </w:pPr>
+    </w:lvl>
+    <w:lvl w:ilvl="8" w:tentative="1">
+      <w:start w:val="1"/>
+      <w:numFmt w:val="decimal"/>
+      <w:lvlText w:val="%9."/>
+      <w:lvlJc w:val="left"/>
+      <w:pPr>
+        <w:tabs>
+          <w:tab w:val="num" w:pos="6480"/>
+        </w:tabs>
+        <w:ind w:left="6480" w:hanging="360"/>
+      </w:pPr>
+    </w:lvl>
+  </w:abstractNum>
+  <w:abstractNum w:abstractNumId="1" w15:restartNumberingAfterBreak="0">
     <w:nsid w:val="27582102"/>
     <w:multiLevelType w:val="multilevel"/>
     <w:tmpl w:val="E9005DAA"/>
@@ -7307,7 +9048,7 @@
       </w:pPr>
     </w:lvl>
   </w:abstractNum>
-  <w:abstractNum w:abstractNumId="1" w15:restartNumberingAfterBreak="0">
+  <w:abstractNum w:abstractNumId="2" w15:restartNumberingAfterBreak="0">
     <w:nsid w:val="420C0980"/>
     <w:multiLevelType w:val="multilevel"/>
     <w:tmpl w:val="2A54559A"/>
@@ -7456,7 +9197,233 @@
       </w:rPr>
     </w:lvl>
   </w:abstractNum>
-  <w:abstractNum w:abstractNumId="2" w15:restartNumberingAfterBreak="0">
+  <w:abstractNum w:abstractNumId="3" w15:restartNumberingAfterBreak="0">
+    <w:nsid w:val="48506621"/>
+    <w:multiLevelType w:val="multilevel"/>
+    <w:tmpl w:val="AE380BCE"/>
+    <w:lvl w:ilvl="0">
+      <w:start w:val="1"/>
+      <w:numFmt w:val="decimal"/>
+      <w:lvlText w:val="%1."/>
+      <w:lvlJc w:val="left"/>
+      <w:pPr>
+        <w:tabs>
+          <w:tab w:val="num" w:pos="720"/>
+        </w:tabs>
+        <w:ind w:left="720" w:hanging="360"/>
+      </w:pPr>
+    </w:lvl>
+    <w:lvl w:ilvl="1" w:tentative="1">
+      <w:start w:val="1"/>
+      <w:numFmt w:val="decimal"/>
+      <w:lvlText w:val="%2."/>
+      <w:lvlJc w:val="left"/>
+      <w:pPr>
+        <w:tabs>
+          <w:tab w:val="num" w:pos="1440"/>
+        </w:tabs>
+        <w:ind w:left="1440" w:hanging="360"/>
+      </w:pPr>
+    </w:lvl>
+    <w:lvl w:ilvl="2" w:tentative="1">
+      <w:start w:val="1"/>
+      <w:numFmt w:val="decimal"/>
+      <w:lvlText w:val="%3."/>
+      <w:lvlJc w:val="left"/>
+      <w:pPr>
+        <w:tabs>
+          <w:tab w:val="num" w:pos="2160"/>
+        </w:tabs>
+        <w:ind w:left="2160" w:hanging="360"/>
+      </w:pPr>
+    </w:lvl>
+    <w:lvl w:ilvl="3" w:tentative="1">
+      <w:start w:val="1"/>
+      <w:numFmt w:val="decimal"/>
+      <w:lvlText w:val="%4."/>
+      <w:lvlJc w:val="left"/>
+      <w:pPr>
+        <w:tabs>
+          <w:tab w:val="num" w:pos="2880"/>
+        </w:tabs>
+        <w:ind w:left="2880" w:hanging="360"/>
+      </w:pPr>
+    </w:lvl>
+    <w:lvl w:ilvl="4" w:tentative="1">
+      <w:start w:val="1"/>
+      <w:numFmt w:val="decimal"/>
+      <w:lvlText w:val="%5."/>
+      <w:lvlJc w:val="left"/>
+      <w:pPr>
+        <w:tabs>
+          <w:tab w:val="num" w:pos="3600"/>
+        </w:tabs>
+        <w:ind w:left="3600" w:hanging="360"/>
+      </w:pPr>
+    </w:lvl>
+    <w:lvl w:ilvl="5" w:tentative="1">
+      <w:start w:val="1"/>
+      <w:numFmt w:val="decimal"/>
+      <w:lvlText w:val="%6."/>
+      <w:lvlJc w:val="left"/>
+      <w:pPr>
+        <w:tabs>
+          <w:tab w:val="num" w:pos="4320"/>
+        </w:tabs>
+        <w:ind w:left="4320" w:hanging="360"/>
+      </w:pPr>
+    </w:lvl>
+    <w:lvl w:ilvl="6" w:tentative="1">
+      <w:start w:val="1"/>
+      <w:numFmt w:val="decimal"/>
+      <w:lvlText w:val="%7."/>
+      <w:lvlJc w:val="left"/>
+      <w:pPr>
+        <w:tabs>
+          <w:tab w:val="num" w:pos="5040"/>
+        </w:tabs>
+        <w:ind w:left="5040" w:hanging="360"/>
+      </w:pPr>
+    </w:lvl>
+    <w:lvl w:ilvl="7" w:tentative="1">
+      <w:start w:val="1"/>
+      <w:numFmt w:val="decimal"/>
+      <w:lvlText w:val="%8."/>
+      <w:lvlJc w:val="left"/>
+      <w:pPr>
+        <w:tabs>
+          <w:tab w:val="num" w:pos="5760"/>
+        </w:tabs>
+        <w:ind w:left="5760" w:hanging="360"/>
+      </w:pPr>
+    </w:lvl>
+    <w:lvl w:ilvl="8" w:tentative="1">
+      <w:start w:val="1"/>
+      <w:numFmt w:val="decimal"/>
+      <w:lvlText w:val="%9."/>
+      <w:lvlJc w:val="left"/>
+      <w:pPr>
+        <w:tabs>
+          <w:tab w:val="num" w:pos="6480"/>
+        </w:tabs>
+        <w:ind w:left="6480" w:hanging="360"/>
+      </w:pPr>
+    </w:lvl>
+  </w:abstractNum>
+  <w:abstractNum w:abstractNumId="4" w15:restartNumberingAfterBreak="0">
+    <w:nsid w:val="4AF4318B"/>
+    <w:multiLevelType w:val="multilevel"/>
+    <w:tmpl w:val="D47AE216"/>
+    <w:lvl w:ilvl="0">
+      <w:start w:val="1"/>
+      <w:numFmt w:val="decimal"/>
+      <w:lvlText w:val="%1."/>
+      <w:lvlJc w:val="left"/>
+      <w:pPr>
+        <w:tabs>
+          <w:tab w:val="num" w:pos="720"/>
+        </w:tabs>
+        <w:ind w:left="720" w:hanging="360"/>
+      </w:pPr>
+    </w:lvl>
+    <w:lvl w:ilvl="1" w:tentative="1">
+      <w:start w:val="1"/>
+      <w:numFmt w:val="decimal"/>
+      <w:lvlText w:val="%2."/>
+      <w:lvlJc w:val="left"/>
+      <w:pPr>
+        <w:tabs>
+          <w:tab w:val="num" w:pos="1440"/>
+        </w:tabs>
+        <w:ind w:left="1440" w:hanging="360"/>
+      </w:pPr>
+    </w:lvl>
+    <w:lvl w:ilvl="2" w:tentative="1">
+      <w:start w:val="1"/>
+      <w:numFmt w:val="decimal"/>
+      <w:lvlText w:val="%3."/>
+      <w:lvlJc w:val="left"/>
+      <w:pPr>
+        <w:tabs>
+          <w:tab w:val="num" w:pos="2160"/>
+        </w:tabs>
+        <w:ind w:left="2160" w:hanging="360"/>
+      </w:pPr>
+    </w:lvl>
+    <w:lvl w:ilvl="3" w:tentative="1">
+      <w:start w:val="1"/>
+      <w:numFmt w:val="decimal"/>
+      <w:lvlText w:val="%4."/>
+      <w:lvlJc w:val="left"/>
+      <w:pPr>
+        <w:tabs>
+          <w:tab w:val="num" w:pos="2880"/>
+        </w:tabs>
+        <w:ind w:left="2880" w:hanging="360"/>
+      </w:pPr>
+    </w:lvl>
+    <w:lvl w:ilvl="4" w:tentative="1">
+      <w:start w:val="1"/>
+      <w:numFmt w:val="decimal"/>
+      <w:lvlText w:val="%5."/>
+      <w:lvlJc w:val="left"/>
+      <w:pPr>
+        <w:tabs>
+          <w:tab w:val="num" w:pos="3600"/>
+        </w:tabs>
+        <w:ind w:left="3600" w:hanging="360"/>
+      </w:pPr>
+    </w:lvl>
+    <w:lvl w:ilvl="5" w:tentative="1">
+      <w:start w:val="1"/>
+      <w:numFmt w:val="decimal"/>
+      <w:lvlText w:val="%6."/>
+      <w:lvlJc w:val="left"/>
+      <w:pPr>
+        <w:tabs>
+          <w:tab w:val="num" w:pos="4320"/>
+        </w:tabs>
+        <w:ind w:left="4320" w:hanging="360"/>
+      </w:pPr>
+    </w:lvl>
+    <w:lvl w:ilvl="6" w:tentative="1">
+      <w:start w:val="1"/>
+      <w:numFmt w:val="decimal"/>
+      <w:lvlText w:val="%7."/>
+      <w:lvlJc w:val="left"/>
+      <w:pPr>
+        <w:tabs>
+          <w:tab w:val="num" w:pos="5040"/>
+        </w:tabs>
+        <w:ind w:left="5040" w:hanging="360"/>
+      </w:pPr>
+    </w:lvl>
+    <w:lvl w:ilvl="7" w:tentative="1">
+      <w:start w:val="1"/>
+      <w:numFmt w:val="decimal"/>
+      <w:lvlText w:val="%8."/>
+      <w:lvlJc w:val="left"/>
+      <w:pPr>
+        <w:tabs>
+          <w:tab w:val="num" w:pos="5760"/>
+        </w:tabs>
+        <w:ind w:left="5760" w:hanging="360"/>
+      </w:pPr>
+    </w:lvl>
+    <w:lvl w:ilvl="8" w:tentative="1">
+      <w:start w:val="1"/>
+      <w:numFmt w:val="decimal"/>
+      <w:lvlText w:val="%9."/>
+      <w:lvlJc w:val="left"/>
+      <w:pPr>
+        <w:tabs>
+          <w:tab w:val="num" w:pos="6480"/>
+        </w:tabs>
+        <w:ind w:left="6480" w:hanging="360"/>
+      </w:pPr>
+    </w:lvl>
+  </w:abstractNum>
+  <w:abstractNum w:abstractNumId="5" w15:restartNumberingAfterBreak="0">
     <w:nsid w:val="4F192CBF"/>
     <w:multiLevelType w:val="multilevel"/>
     <w:tmpl w:val="CC546428"/>
@@ -7605,7 +9572,7 @@
       </w:rPr>
     </w:lvl>
   </w:abstractNum>
-  <w:abstractNum w:abstractNumId="3" w15:restartNumberingAfterBreak="0">
+  <w:abstractNum w:abstractNumId="6" w15:restartNumberingAfterBreak="0">
     <w:nsid w:val="4F3B4054"/>
     <w:multiLevelType w:val="multilevel"/>
     <w:tmpl w:val="5358DD86"/>
@@ -7718,7 +9685,7 @@
       </w:pPr>
     </w:lvl>
   </w:abstractNum>
-  <w:abstractNum w:abstractNumId="4" w15:restartNumberingAfterBreak="0">
+  <w:abstractNum w:abstractNumId="7" w15:restartNumberingAfterBreak="0">
     <w:nsid w:val="590671D0"/>
     <w:multiLevelType w:val="multilevel"/>
     <w:tmpl w:val="F42AABEC"/>
@@ -7831,7 +9798,120 @@
       </w:pPr>
     </w:lvl>
   </w:abstractNum>
-  <w:abstractNum w:abstractNumId="5" w15:restartNumberingAfterBreak="0">
+  <w:abstractNum w:abstractNumId="8" w15:restartNumberingAfterBreak="0">
+    <w:nsid w:val="5999132E"/>
+    <w:multiLevelType w:val="multilevel"/>
+    <w:tmpl w:val="1FB02B2E"/>
+    <w:lvl w:ilvl="0">
+      <w:start w:val="5"/>
+      <w:numFmt w:val="decimal"/>
+      <w:lvlText w:val="%1."/>
+      <w:lvlJc w:val="left"/>
+      <w:pPr>
+        <w:tabs>
+          <w:tab w:val="num" w:pos="720"/>
+        </w:tabs>
+        <w:ind w:left="720" w:hanging="360"/>
+      </w:pPr>
+    </w:lvl>
+    <w:lvl w:ilvl="1" w:tentative="1">
+      <w:start w:val="1"/>
+      <w:numFmt w:val="decimal"/>
+      <w:lvlText w:val="%2."/>
+      <w:lvlJc w:val="left"/>
+      <w:pPr>
+        <w:tabs>
+          <w:tab w:val="num" w:pos="1440"/>
+        </w:tabs>
+        <w:ind w:left="1440" w:hanging="360"/>
+      </w:pPr>
+    </w:lvl>
+    <w:lvl w:ilvl="2" w:tentative="1">
+      <w:start w:val="1"/>
+      <w:numFmt w:val="decimal"/>
+      <w:lvlText w:val="%3."/>
+      <w:lvlJc w:val="left"/>
+      <w:pPr>
+        <w:tabs>
+          <w:tab w:val="num" w:pos="2160"/>
+        </w:tabs>
+        <w:ind w:left="2160" w:hanging="360"/>
+      </w:pPr>
+    </w:lvl>
+    <w:lvl w:ilvl="3" w:tentative="1">
+      <w:start w:val="1"/>
+      <w:numFmt w:val="decimal"/>
+      <w:lvlText w:val="%4."/>
+      <w:lvlJc w:val="left"/>
+      <w:pPr>
+        <w:tabs>
+          <w:tab w:val="num" w:pos="2880"/>
+        </w:tabs>
+        <w:ind w:left="2880" w:hanging="360"/>
+      </w:pPr>
+    </w:lvl>
+    <w:lvl w:ilvl="4" w:tentative="1">
+      <w:start w:val="1"/>
+      <w:numFmt w:val="decimal"/>
+      <w:lvlText w:val="%5."/>
+      <w:lvlJc w:val="left"/>
+      <w:pPr>
+        <w:tabs>
+          <w:tab w:val="num" w:pos="3600"/>
+        </w:tabs>
+        <w:ind w:left="3600" w:hanging="360"/>
+      </w:pPr>
+    </w:lvl>
+    <w:lvl w:ilvl="5" w:tentative="1">
+      <w:start w:val="1"/>
+      <w:numFmt w:val="decimal"/>
+      <w:lvlText w:val="%6."/>
+      <w:lvlJc w:val="left"/>
+      <w:pPr>
+        <w:tabs>
+          <w:tab w:val="num" w:pos="4320"/>
+        </w:tabs>
+        <w:ind w:left="4320" w:hanging="360"/>
+      </w:pPr>
+    </w:lvl>
+    <w:lvl w:ilvl="6" w:tentative="1">
+      <w:start w:val="1"/>
+      <w:numFmt w:val="decimal"/>
+      <w:lvlText w:val="%7."/>
+      <w:lvlJc w:val="left"/>
+      <w:pPr>
+        <w:tabs>
+          <w:tab w:val="num" w:pos="5040"/>
+        </w:tabs>
+        <w:ind w:left="5040" w:hanging="360"/>
+      </w:pPr>
+    </w:lvl>
+    <w:lvl w:ilvl="7" w:tentative="1">
+      <w:start w:val="1"/>
+      <w:numFmt w:val="decimal"/>
+      <w:lvlText w:val="%8."/>
+      <w:lvlJc w:val="left"/>
+      <w:pPr>
+        <w:tabs>
+          <w:tab w:val="num" w:pos="5760"/>
+        </w:tabs>
+        <w:ind w:left="5760" w:hanging="360"/>
+      </w:pPr>
+    </w:lvl>
+    <w:lvl w:ilvl="8" w:tentative="1">
+      <w:start w:val="1"/>
+      <w:numFmt w:val="decimal"/>
+      <w:lvlText w:val="%9."/>
+      <w:lvlJc w:val="left"/>
+      <w:pPr>
+        <w:tabs>
+          <w:tab w:val="num" w:pos="6480"/>
+        </w:tabs>
+        <w:ind w:left="6480" w:hanging="360"/>
+      </w:pPr>
+    </w:lvl>
+  </w:abstractNum>
+  <w:abstractNum w:abstractNumId="9" w15:restartNumberingAfterBreak="0">
     <w:nsid w:val="5C54496A"/>
     <w:multiLevelType w:val="multilevel"/>
     <w:tmpl w:val="60982A9E"/>
@@ -7944,7 +10024,7 @@
       </w:pPr>
     </w:lvl>
   </w:abstractNum>
-  <w:abstractNum w:abstractNumId="6" w15:restartNumberingAfterBreak="0">
+  <w:abstractNum w:abstractNumId="10" w15:restartNumberingAfterBreak="0">
     <w:nsid w:val="647F2175"/>
     <w:multiLevelType w:val="multilevel"/>
     <w:tmpl w:val="9B6877CC"/>
@@ -8057,7 +10137,120 @@
       </w:pPr>
     </w:lvl>
   </w:abstractNum>
-  <w:abstractNum w:abstractNumId="7" w15:restartNumberingAfterBreak="0">
+  <w:abstractNum w:abstractNumId="11" w15:restartNumberingAfterBreak="0">
+    <w:nsid w:val="6A3A7098"/>
+    <w:multiLevelType w:val="multilevel"/>
+    <w:tmpl w:val="748A3A72"/>
+    <w:lvl w:ilvl="0">
+      <w:start w:val="8"/>
+      <w:numFmt w:val="decimal"/>
+      <w:lvlText w:val="%1."/>
+      <w:lvlJc w:val="left"/>
+      <w:pPr>
+        <w:tabs>
+          <w:tab w:val="num" w:pos="720"/>
+        </w:tabs>
+        <w:ind w:left="720" w:hanging="360"/>
+      </w:pPr>
+    </w:lvl>
+    <w:lvl w:ilvl="1" w:tentative="1">
+      <w:start w:val="1"/>
+      <w:numFmt w:val="decimal"/>
+      <w:lvlText w:val="%2."/>
+      <w:lvlJc w:val="left"/>
+      <w:pPr>
+        <w:tabs>
+          <w:tab w:val="num" w:pos="1440"/>
+        </w:tabs>
+        <w:ind w:left="1440" w:hanging="360"/>
+      </w:pPr>
+    </w:lvl>
+    <w:lvl w:ilvl="2" w:tentative="1">
+      <w:start w:val="1"/>
+      <w:numFmt w:val="decimal"/>
+      <w:lvlText w:val="%3."/>
+      <w:lvlJc w:val="left"/>
+      <w:pPr>
+        <w:tabs>
+          <w:tab w:val="num" w:pos="2160"/>
+        </w:tabs>
+        <w:ind w:left="2160" w:hanging="360"/>
+      </w:pPr>
+    </w:lvl>
+    <w:lvl w:ilvl="3" w:tentative="1">
+      <w:start w:val="1"/>
+      <w:numFmt w:val="decimal"/>
+      <w:lvlText w:val="%4."/>
+      <w:lvlJc w:val="left"/>
+      <w:pPr>
+        <w:tabs>
+          <w:tab w:val="num" w:pos="2880"/>
+        </w:tabs>
+        <w:ind w:left="2880" w:hanging="360"/>
+      </w:pPr>
+    </w:lvl>
+    <w:lvl w:ilvl="4" w:tentative="1">
+      <w:start w:val="1"/>
+      <w:numFmt w:val="decimal"/>
+      <w:lvlText w:val="%5."/>
+      <w:lvlJc w:val="left"/>
+      <w:pPr>
+        <w:tabs>
+          <w:tab w:val="num" w:pos="3600"/>
+        </w:tabs>
+        <w:ind w:left="3600" w:hanging="360"/>
+      </w:pPr>
+    </w:lvl>
+    <w:lvl w:ilvl="5" w:tentative="1">
+      <w:start w:val="1"/>
+      <w:numFmt w:val="decimal"/>
+      <w:lvlText w:val="%6."/>
+      <w:lvlJc w:val="left"/>
+      <w:pPr>
+        <w:tabs>
+          <w:tab w:val="num" w:pos="4320"/>
+        </w:tabs>
+        <w:ind w:left="4320" w:hanging="360"/>
+      </w:pPr>
+    </w:lvl>
+    <w:lvl w:ilvl="6" w:tentative="1">
+      <w:start w:val="1"/>
+      <w:numFmt w:val="decimal"/>
+      <w:lvlText w:val="%7."/>
+      <w:lvlJc w:val="left"/>
+      <w:pPr>
+        <w:tabs>
+          <w:tab w:val="num" w:pos="5040"/>
+        </w:tabs>
+        <w:ind w:left="5040" w:hanging="360"/>
+      </w:pPr>
+    </w:lvl>
+    <w:lvl w:ilvl="7" w:tentative="1">
+      <w:start w:val="1"/>
+      <w:numFmt w:val="decimal"/>
+      <w:lvlText w:val="%8."/>
+      <w:lvlJc w:val="left"/>
+      <w:pPr>
+        <w:tabs>
+          <w:tab w:val="num" w:pos="5760"/>
+        </w:tabs>
+        <w:ind w:left="5760" w:hanging="360"/>
+      </w:pPr>
+    </w:lvl>
+    <w:lvl w:ilvl="8" w:tentative="1">
+      <w:start w:val="1"/>
+      <w:numFmt w:val="decimal"/>
+      <w:lvlText w:val="%9."/>
+      <w:lvlJc w:val="left"/>
+      <w:pPr>
+        <w:tabs>
+          <w:tab w:val="num" w:pos="6480"/>
+        </w:tabs>
+        <w:ind w:left="6480" w:hanging="360"/>
+      </w:pPr>
+    </w:lvl>
+  </w:abstractNum>
+  <w:abstractNum w:abstractNumId="12" w15:restartNumberingAfterBreak="0">
     <w:nsid w:val="70B76621"/>
     <w:multiLevelType w:val="multilevel"/>
     <w:tmpl w:val="B05AECC6"/>
@@ -8206,7 +10399,120 @@
       </w:rPr>
     </w:lvl>
   </w:abstractNum>
-  <w:abstractNum w:abstractNumId="8" w15:restartNumberingAfterBreak="0">
+  <w:abstractNum w:abstractNumId="13" w15:restartNumberingAfterBreak="0">
+    <w:nsid w:val="76B966C4"/>
+    <w:multiLevelType w:val="multilevel"/>
+    <w:tmpl w:val="745C8652"/>
+    <w:lvl w:ilvl="0">
+      <w:start w:val="1"/>
+      <w:numFmt w:val="decimal"/>
+      <w:lvlText w:val="%1."/>
+      <w:lvlJc w:val="left"/>
+      <w:pPr>
+        <w:tabs>
+          <w:tab w:val="num" w:pos="720"/>
+        </w:tabs>
+        <w:ind w:left="720" w:hanging="360"/>
+      </w:pPr>
+    </w:lvl>
+    <w:lvl w:ilvl="1" w:tentative="1">
+      <w:start w:val="1"/>
+      <w:numFmt w:val="decimal"/>
+      <w:lvlText w:val="%2."/>
+      <w:lvlJc w:val="left"/>
+      <w:pPr>
+        <w:tabs>
+          <w:tab w:val="num" w:pos="1440"/>
+        </w:tabs>
+        <w:ind w:left="1440" w:hanging="360"/>
+      </w:pPr>
+    </w:lvl>
+    <w:lvl w:ilvl="2" w:tentative="1">
+      <w:start w:val="1"/>
+      <w:numFmt w:val="decimal"/>
+      <w:lvlText w:val="%3."/>
+      <w:lvlJc w:val="left"/>
+      <w:pPr>
+        <w:tabs>
+          <w:tab w:val="num" w:pos="2160"/>
+        </w:tabs>
+        <w:ind w:left="2160" w:hanging="360"/>
+      </w:pPr>
+    </w:lvl>
+    <w:lvl w:ilvl="3" w:tentative="1">
+      <w:start w:val="1"/>
+      <w:numFmt w:val="decimal"/>
+      <w:lvlText w:val="%4."/>
+      <w:lvlJc w:val="left"/>
+      <w:pPr>
+        <w:tabs>
+          <w:tab w:val="num" w:pos="2880"/>
+        </w:tabs>
+        <w:ind w:left="2880" w:hanging="360"/>
+      </w:pPr>
+    </w:lvl>
+    <w:lvl w:ilvl="4" w:tentative="1">
+      <w:start w:val="1"/>
+      <w:numFmt w:val="decimal"/>
+      <w:lvlText w:val="%5."/>
+      <w:lvlJc w:val="left"/>
+      <w:pPr>
+        <w:tabs>
+          <w:tab w:val="num" w:pos="3600"/>
+        </w:tabs>
+        <w:ind w:left="3600" w:hanging="360"/>
+      </w:pPr>
+    </w:lvl>
+    <w:lvl w:ilvl="5" w:tentative="1">
+      <w:start w:val="1"/>
+      <w:numFmt w:val="decimal"/>
+      <w:lvlText w:val="%6."/>
+      <w:lvlJc w:val="left"/>
+      <w:pPr>
+        <w:tabs>
+          <w:tab w:val="num" w:pos="4320"/>
+        </w:tabs>
+        <w:ind w:left="4320" w:hanging="360"/>
+      </w:pPr>
+    </w:lvl>
+    <w:lvl w:ilvl="6" w:tentative="1">
+      <w:start w:val="1"/>
+      <w:numFmt w:val="decimal"/>
+      <w:lvlText w:val="%7."/>
+      <w:lvlJc w:val="left"/>
+      <w:pPr>
+        <w:tabs>
+          <w:tab w:val="num" w:pos="5040"/>
+        </w:tabs>
+        <w:ind w:left="5040" w:hanging="360"/>
+      </w:pPr>
+    </w:lvl>
+    <w:lvl w:ilvl="7" w:tentative="1">
+      <w:start w:val="1"/>
+      <w:numFmt w:val="decimal"/>
+      <w:lvlText w:val="%8."/>
+      <w:lvlJc w:val="left"/>
+      <w:pPr>
+        <w:tabs>
+          <w:tab w:val="num" w:pos="5760"/>
+        </w:tabs>
+        <w:ind w:left="5760" w:hanging="360"/>
+      </w:pPr>
+    </w:lvl>
+    <w:lvl w:ilvl="8" w:tentative="1">
+      <w:start w:val="1"/>
+      <w:numFmt w:val="decimal"/>
+      <w:lvlText w:val="%9."/>
+      <w:lvlJc w:val="left"/>
+      <w:pPr>
+        <w:tabs>
+          <w:tab w:val="num" w:pos="6480"/>
+        </w:tabs>
+        <w:ind w:left="6480" w:hanging="360"/>
+      </w:pPr>
+    </w:lvl>
+  </w:abstractNum>
+  <w:abstractNum w:abstractNumId="14" w15:restartNumberingAfterBreak="0">
     <w:nsid w:val="78FA61AA"/>
     <w:multiLevelType w:val="multilevel"/>
     <w:tmpl w:val="139A7094"/>
@@ -8319,7 +10625,7 @@
       </w:pPr>
     </w:lvl>
   </w:abstractNum>
-  <w:abstractNum w:abstractNumId="9" w15:restartNumberingAfterBreak="0">
+  <w:abstractNum w:abstractNumId="15" w15:restartNumberingAfterBreak="0">
     <w:nsid w:val="7DB153BF"/>
     <w:multiLevelType w:val="multilevel"/>
     <w:tmpl w:val="2AC64E36"/>
@@ -8433,34 +10739,52 @@
     </w:lvl>
   </w:abstractNum>
   <w:num w:numId="1">
+    <w:abstractNumId w:val="15"/>
+  </w:num>
+  <w:num w:numId="2">
+    <w:abstractNumId w:val="5"/>
+  </w:num>
+  <w:num w:numId="3">
+    <w:abstractNumId w:val="14"/>
+  </w:num>
+  <w:num w:numId="4">
+    <w:abstractNumId w:val="1"/>
+  </w:num>
+  <w:num w:numId="5">
+    <w:abstractNumId w:val="10"/>
+  </w:num>
+  <w:num w:numId="6">
+    <w:abstractNumId w:val="7"/>
+  </w:num>
+  <w:num w:numId="7">
     <w:abstractNumId w:val="9"/>
   </w:num>
-  <w:num w:numId="2">
+  <w:num w:numId="8">
+    <w:abstractNumId w:val="6"/>
+  </w:num>
+  <w:num w:numId="9">
     <w:abstractNumId w:val="2"/>
   </w:num>
-  <w:num w:numId="3">
+  <w:num w:numId="10">
+    <w:abstractNumId w:val="12"/>
+  </w:num>
+  <w:num w:numId="11">
+    <w:abstractNumId w:val="4"/>
+  </w:num>
+  <w:num w:numId="12">
+    <w:abstractNumId w:val="0"/>
+  </w:num>
+  <w:num w:numId="13">
+    <w:abstractNumId w:val="13"/>
+  </w:num>
+  <w:num w:numId="14">
     <w:abstractNumId w:val="8"/>
   </w:num>
-  <w:num w:numId="4">
-    <w:abstractNumId w:val="0"/>
+  <w:num w:numId="15">
+    <w:abstractNumId w:val="11"/>
   </w:num>
-  <w:num w:numId="5">
-    <w:abstractNumId w:val="6"/>
-  </w:num>
-  <w:num w:numId="6">
-    <w:abstractNumId w:val="4"/>
-  </w:num>
-  <w:num w:numId="7">
-    <w:abstractNumId w:val="5"/>
-  </w:num>
-  <w:num w:numId="8">
+  <w:num w:numId="16">
     <w:abstractNumId w:val="3"/>
-  </w:num>
-  <w:num w:numId="9">
-    <w:abstractNumId w:val="1"/>
-  </w:num>
-  <w:num w:numId="10">
-    <w:abstractNumId w:val="7"/>
   </w:num>
 </w:numbering>
 </file>

</xml_diff>